<commit_message>
TBDT tai lieu: anh, Word/PDF, video, trang Huong dan, lop mau 8A0 co vi pham
- Lop mau 8A0: 7 lan vi pham thiet bi (dang tam dung, moi phu huynh), 1 nhiem vu co minh chung
- Chup lai anh, dung lai hai tai lieu (15 trang moi bo), quay lai hai bo video
- Trang Huong dan: luat thiet bi, thang xu ly, minh chung bat buoc
- O hop viec: 'Vi pham thiet bi chua xong' khong doi nghia con so
- README muc 11f, ghi chu ky luat quen dang ky dang tat

Co-Authored-By: Claude Opus 5.5 <noreply@anthropic.com>
</commit_message>
<xml_diff>
--- a/docs/huong-dan/Huong-dan-hoc-sinh.docx
+++ b/docs/huong-dan/Huong-dan-hoc-sinh.docx
@@ -96,7 +96,7 @@
           <w:sz w:val="18"/>
           <w:szCs w:val="18"/>
         </w:rPr>
-        <w:t xml:space="preserve">Cập nhật 14/9/2026</w:t>
+        <w:t xml:space="preserve">Cập nhật 4/10/2026</w:t>
       </w:r>
     </w:p>
     <w:p>
@@ -309,7 +309,7 @@
           <w:sz w:val="21"/>
           <w:szCs w:val="21"/>
         </w:rPr>
-        <w:t xml:space="preserve">	7</w:t>
+        <w:t xml:space="preserve">	8</w:t>
       </w:r>
     </w:p>
     <w:p>
@@ -341,7 +341,7 @@
           <w:sz w:val="21"/>
           <w:szCs w:val="21"/>
         </w:rPr>
-        <w:t xml:space="preserve">	7</w:t>
+        <w:t xml:space="preserve">	8</w:t>
       </w:r>
     </w:p>
     <w:p>
@@ -373,7 +373,7 @@
           <w:sz w:val="21"/>
           <w:szCs w:val="21"/>
         </w:rPr>
-        <w:t xml:space="preserve">	9</w:t>
+        <w:t xml:space="preserve">	11</w:t>
       </w:r>
     </w:p>
     <w:p>
@@ -394,7 +394,7 @@
           <w:sz w:val="21"/>
           <w:szCs w:val="21"/>
         </w:rPr>
-        <w:t xml:space="preserve">9. Quên đăng ký và lao động công ích</w:t>
+        <w:t xml:space="preserve">9. Thiết bị điện tử và xử lý vi phạm</w:t>
       </w:r>
       <w:r>
         <w:rPr>
@@ -405,7 +405,7 @@
           <w:sz w:val="21"/>
           <w:szCs w:val="21"/>
         </w:rPr>
-        <w:t xml:space="preserve">	9</w:t>
+        <w:t xml:space="preserve">	11</w:t>
       </w:r>
     </w:p>
     <w:p>
@@ -437,7 +437,7 @@
           <w:sz w:val="21"/>
           <w:szCs w:val="21"/>
         </w:rPr>
-        <w:t xml:space="preserve">	11</w:t>
+        <w:t xml:space="preserve">	13</w:t>
       </w:r>
     </w:p>
     <w:p>
@@ -469,7 +469,7 @@
           <w:sz w:val="21"/>
           <w:szCs w:val="21"/>
         </w:rPr>
-        <w:t xml:space="preserve">	11</w:t>
+        <w:t xml:space="preserve">	13</w:t>
       </w:r>
     </w:p>
     <w:p>
@@ -501,7 +501,7 @@
           <w:sz w:val="21"/>
           <w:szCs w:val="21"/>
         </w:rPr>
-        <w:t xml:space="preserve">	12</w:t>
+        <w:t xml:space="preserve">	14</w:t>
       </w:r>
     </w:p>
     <w:p>
@@ -533,7 +533,7 @@
           <w:sz w:val="21"/>
           <w:szCs w:val="21"/>
         </w:rPr>
-        <w:t xml:space="preserve">	13</w:t>
+        <w:t xml:space="preserve">	15</w:t>
       </w:r>
     </w:p>
     <w:p>
@@ -768,6 +768,159 @@
         </w:rPr>
         <w:t xml:space="preserve"> sau 5 ngày.</w:t>
       </w:r>
+    </w:p>
+    <w:tbl>
+      <w:tblPr>
+        <w:tblW w:type="dxa" w:w="9070"/>
+        <w:tblBorders>
+          <w:top w:val="single" w:color="C05621" w:sz="8"/>
+          <w:left w:val="single" w:color="C05621" w:sz="24"/>
+          <w:bottom w:val="single" w:color="C05621" w:sz="8"/>
+          <w:right w:val="single" w:color="C05621" w:sz="8"/>
+          <w:insideH w:val="none"/>
+          <w:insideV w:val="none"/>
+        </w:tblBorders>
+        <w:tblLayout w:type="fixed"/>
+      </w:tblPr>
+      <w:tblGrid>
+        <w:gridCol w:w="9070"/>
+      </w:tblGrid>
+      <w:tr>
+        <w:tc>
+          <w:tcPr>
+            <w:tcW w:type="dxa" w:w="9070"/>
+            <w:shd w:fill="FDF1E7" w:val="clear"/>
+            <w:tcMar>
+              <w:top w:type="dxa" w:w="90"/>
+              <w:left w:type="dxa" w:w="150"/>
+              <w:bottom w:type="dxa" w:w="90"/>
+              <w:right w:type="dxa" w:w="150"/>
+            </w:tcMar>
+          </w:tcPr>
+          <w:p>
+            <w:pPr>
+              <w:spacing w:after="50"/>
+            </w:pPr>
+            <w:r>
+              <w:rPr>
+                <w:rFonts w:ascii="Arial" w:cs="Arial" w:eastAsia="Arial" w:hAnsi="Arial"/>
+                <w:b/>
+                <w:bCs/>
+                <w:color w:val="C05621"/>
+                <w:sz w:val="18"/>
+                <w:szCs w:val="18"/>
+              </w:rPr>
+              <w:t xml:space="preserve">CẨN THẬN</w:t>
+            </w:r>
+          </w:p>
+          <w:p>
+            <w:pPr>
+              <w:spacing w:after="0" w:line="252"/>
+            </w:pPr>
+            <w:r>
+              <w:rPr>
+                <w:rFonts w:ascii="Arial" w:cs="Arial" w:eastAsia="Arial" w:hAnsi="Arial"/>
+                <w:b/>
+                <w:bCs/>
+                <w:i w:val="false"/>
+                <w:iCs w:val="false"/>
+                <w:color w:val="1A1A1A"/>
+                <w:sz w:val="20"/>
+                <w:szCs w:val="20"/>
+              </w:rPr>
+              <w:t xml:space="preserve">Từ tháng 10/2026:</w:t>
+            </w:r>
+            <w:r>
+              <w:rPr>
+                <w:rFonts w:ascii="Arial" w:cs="Arial" w:eastAsia="Arial" w:hAnsi="Arial"/>
+                <w:b w:val="false"/>
+                <w:bCs w:val="false"/>
+                <w:i w:val="false"/>
+                <w:iCs w:val="false"/>
+                <w:color w:val="1A1A1A"/>
+                <w:sz w:val="20"/>
+                <w:szCs w:val="20"/>
+              </w:rPr>
+              <w:t xml:space="preserve"> em </w:t>
+            </w:r>
+            <w:r>
+              <w:rPr>
+                <w:rFonts w:ascii="Arial" w:cs="Arial" w:eastAsia="Arial" w:hAnsi="Arial"/>
+                <w:b/>
+                <w:bCs/>
+                <w:i w:val="false"/>
+                <w:iCs w:val="false"/>
+                <w:color w:val="1A1A1A"/>
+                <w:sz w:val="20"/>
+                <w:szCs w:val="20"/>
+              </w:rPr>
+              <w:t xml:space="preserve">chỉ bắt buộc đăng ký khi cần dùng thiết bị điện tử</w:t>
+            </w:r>
+            <w:r>
+              <w:rPr>
+                <w:rFonts w:ascii="Arial" w:cs="Arial" w:eastAsia="Arial" w:hAnsi="Arial"/>
+                <w:b w:val="false"/>
+                <w:bCs w:val="false"/>
+                <w:i w:val="false"/>
+                <w:iCs w:val="false"/>
+                <w:color w:val="1A1A1A"/>
+                <w:sz w:val="20"/>
+                <w:szCs w:val="20"/>
+              </w:rPr>
+              <w:t xml:space="preserve"> (máy tính, điện thoại, máy tính bảng). Không dùng thiết bị thì đăng ký là tuỳ em — nhưng vẫn rất nên làm, vì đó là cách em tự lên kế hoạch.</w:t>
+            </w:r>
+          </w:p>
+          <w:p>
+            <w:pPr>
+              <w:spacing w:after="0" w:line="252"/>
+            </w:pPr>
+            <w:r>
+              <w:rPr>
+                <w:rFonts w:ascii="Arial" w:cs="Arial" w:eastAsia="Arial" w:hAnsi="Arial"/>
+                <w:b w:val="false"/>
+                <w:bCs w:val="false"/>
+                <w:i w:val="false"/>
+                <w:iCs w:val="false"/>
+                <w:color w:val="1A1A1A"/>
+                <w:sz w:val="20"/>
+                <w:szCs w:val="20"/>
+              </w:rPr>
+              <w:t xml:space="preserve">Không đăng ký mà tự ý dùng thiết bị, hoặc dùng sai mục đích đã đăng ký, là </w:t>
+            </w:r>
+            <w:r>
+              <w:rPr>
+                <w:rFonts w:ascii="Arial" w:cs="Arial" w:eastAsia="Arial" w:hAnsi="Arial"/>
+                <w:b/>
+                <w:bCs/>
+                <w:i w:val="false"/>
+                <w:iCs w:val="false"/>
+                <w:color w:val="1A1A1A"/>
+                <w:sz w:val="20"/>
+                <w:szCs w:val="20"/>
+              </w:rPr>
+              <w:t xml:space="preserve">vi phạm</w:t>
+            </w:r>
+            <w:r>
+              <w:rPr>
+                <w:rFonts w:ascii="Arial" w:cs="Arial" w:eastAsia="Arial" w:hAnsi="Arial"/>
+                <w:b w:val="false"/>
+                <w:bCs w:val="false"/>
+                <w:i w:val="false"/>
+                <w:iCs w:val="false"/>
+                <w:color w:val="1A1A1A"/>
+                <w:sz w:val="20"/>
+                <w:szCs w:val="20"/>
+              </w:rPr>
+              <w:t xml:space="preserve"> — xem mục 9.</w:t>
+            </w:r>
+          </w:p>
+        </w:tc>
+      </w:tr>
+    </w:tbl>
+    <w:p>
+      <w:pPr>
+        <w:spacing w:after="110"/>
+      </w:pPr>
     </w:p>
     <w:p>
       <w:pPr>
@@ -2282,7 +2435,7 @@
           <w:sz w:val="20"/>
           <w:szCs w:val="20"/>
         </w:rPr>
-        <w:t xml:space="preserve">Thẻ điểm danh</w:t>
+        <w:t xml:space="preserve">Thẻ thiết bị điện tử</w:t>
       </w:r>
       <w:r>
         <w:rPr>
@@ -2295,7 +2448,7 @@
           <w:sz w:val="20"/>
           <w:szCs w:val="20"/>
         </w:rPr>
-        <w:t xml:space="preserve"> — học kỳ này em đã quên đăng ký mấy lần, còn mấy lần được miễn trừ.</w:t>
+        <w:t xml:space="preserve"> — tuần này em đã dùng thiết bị mấy ngày, lớp giới hạn thế nào, và em đã vi phạm lần nào chưa.</w:t>
       </w:r>
     </w:p>
     <w:p>
@@ -2611,7 +2764,7 @@
                 <w:sz w:val="20"/>
                 <w:szCs w:val="20"/>
               </w:rPr>
-              <w:t xml:space="preserve">. Không đăng ký gì cả thì tính là </w:t>
+              <w:t xml:space="preserve">. Buổi nào </w:t>
             </w:r>
             <w:r>
               <w:rPr>
@@ -2624,7 +2777,7 @@
                 <w:sz w:val="20"/>
                 <w:szCs w:val="20"/>
               </w:rPr>
-              <w:t xml:space="preserve">quên đăng ký</w:t>
+              <w:t xml:space="preserve">cần dùng thiết bị</w:t>
             </w:r>
             <w:r>
               <w:rPr>
@@ -2637,7 +2790,7 @@
                 <w:sz w:val="20"/>
                 <w:szCs w:val="20"/>
               </w:rPr>
-              <w:t xml:space="preserve"> — xem mục 9.</w:t>
+              <w:t xml:space="preserve"> thì bắt buộc phải đăng ký trước — xem mục 9.</w:t>
             </w:r>
           </w:p>
         </w:tc>
@@ -2684,7 +2837,7 @@
             <w:r>
               <w:drawing>
                 <wp:inline distT="0" distB="0" distL="0" distR="0">
-                  <wp:extent cx="3133725" cy="3228975"/>
+                  <wp:extent cx="3133725" cy="3448050"/>
                   <wp:effectExtent t="0" r="0" b="0" l="0"/>
                   <wp:docPr id="1" name="" descr="" title=""/>
                   <wp:cNvGraphicFramePr>
@@ -2709,7 +2862,7 @@
                         <pic:spPr bwMode="auto">
                           <a:xfrm>
                             <a:off x="0" y="0"/>
-                            <a:ext cx="3133725" cy="3228975"/>
+                            <a:ext cx="3133725" cy="3448050"/>
                           </a:xfrm>
                           <a:prstGeom prst="rect">
                             <a:avLst/>
@@ -2964,7 +3117,7 @@
                 <w:sz w:val="21"/>
                 <w:szCs w:val="21"/>
               </w:rPr>
-              <w:t xml:space="preserve">Buổi đó cần máy tính hoặc điện thoại thì bật </w:t>
+              <w:t xml:space="preserve">Nhiệm vụ nào cần máy tính hoặc điện thoại thì bật </w:t>
             </w:r>
             <w:r>
               <w:rPr>
@@ -2977,7 +3130,7 @@
                 <w:sz w:val="21"/>
                 <w:szCs w:val="21"/>
               </w:rPr>
-              <w:t xml:space="preserve">Cần dùng thiết bị</w:t>
+              <w:t xml:space="preserve">Dùng thiết bị điện tử</w:t>
             </w:r>
             <w:r>
               <w:rPr>
@@ -3199,6 +3352,388 @@
     </w:p>
     <w:p>
       <w:pPr>
+        <w:pStyle w:val="Heading2"/>
+        <w:keepNext/>
+        <w:spacing w:after="100" w:before="240"/>
+      </w:pPr>
+      <w:r>
+        <w:rPr>
+          <w:rFonts w:ascii="Arial" w:cs="Arial" w:eastAsia="Arial" w:hAnsi="Arial"/>
+          <w:b/>
+          <w:bCs/>
+          <w:color w:val="1C4E80"/>
+          <w:sz w:val="24"/>
+          <w:szCs w:val="24"/>
+        </w:rPr>
+        <w:t xml:space="preserve">Khi công tắc thiết bị bị khoá</w:t>
+      </w:r>
+    </w:p>
+    <w:tbl>
+      <w:tblPr>
+        <w:tblW w:type="dxa" w:w="9070"/>
+        <w:tblBorders>
+          <w:top w:val="none" w:sz="0"/>
+          <w:left w:val="none" w:sz="0"/>
+          <w:bottom w:val="none" w:sz="0"/>
+          <w:right w:val="none" w:sz="0"/>
+          <w:insideH w:val="none" w:sz="0"/>
+          <w:insideV w:val="none" w:sz="0"/>
+        </w:tblBorders>
+        <w:tblLayout w:type="fixed"/>
+      </w:tblPr>
+      <w:tblGrid>
+        <w:gridCol w:w="4512"/>
+        <w:gridCol w:w="4558"/>
+      </w:tblGrid>
+      <w:tr>
+        <w:tc>
+          <w:tcPr>
+            <w:tcW w:type="dxa" w:w="4512"/>
+            <w:tcMar>
+              <w:top w:type="dxa" w:w="0"/>
+              <w:left w:type="dxa" w:w="0"/>
+              <w:bottom w:type="dxa" w:w="0"/>
+              <w:right w:type="dxa" w:w="280"/>
+            </w:tcMar>
+            <w:vAlign w:val="top"/>
+          </w:tcPr>
+          <w:p>
+            <w:pPr>
+              <w:spacing w:after="40" w:before="60"/>
+            </w:pPr>
+            <w:r>
+              <w:drawing>
+                <wp:inline distT="0" distB="0" distL="0" distR="0">
+                  <wp:extent cx="2857500" cy="1162050"/>
+                  <wp:effectExtent t="0" r="0" b="0" l="0"/>
+                  <wp:docPr id="1" name="" descr="" title=""/>
+                  <wp:cNvGraphicFramePr>
+                    <a:graphicFrameLocks xmlns:a="http://schemas.openxmlformats.org/drawingml/2006/main" noChangeAspect="1"/>
+                  </wp:cNvGraphicFramePr>
+                  <a:graphic xmlns:a="http://schemas.openxmlformats.org/drawingml/2006/main">
+                    <a:graphicData uri="http://schemas.openxmlformats.org/drawingml/2006/picture">
+                      <pic:pic xmlns:pic="http://schemas.openxmlformats.org/drawingml/2006/picture">
+                        <pic:nvPicPr>
+                          <pic:cNvPr id="0" name="" descr=""/>
+                          <pic:cNvPicPr>
+                            <a:picLocks noChangeAspect="1" noChangeArrowheads="1"/>
+                          </pic:cNvPicPr>
+                        </pic:nvPicPr>
+                        <pic:blipFill>
+                          <a:blip r:embed="rId14" cstate="none"/>
+                          <a:srcRect/>
+                          <a:stretch>
+                            <a:fillRect/>
+                          </a:stretch>
+                        </pic:blipFill>
+                        <pic:spPr bwMode="auto">
+                          <a:xfrm>
+                            <a:off x="0" y="0"/>
+                            <a:ext cx="2857500" cy="1162050"/>
+                          </a:xfrm>
+                          <a:prstGeom prst="rect">
+                            <a:avLst/>
+                          </a:prstGeom>
+                        </pic:spPr>
+                      </pic:pic>
+                    </a:graphicData>
+                  </a:graphic>
+                </wp:inline>
+              </w:drawing>
+            </w:r>
+          </w:p>
+          <w:p>
+            <w:pPr>
+              <w:spacing w:after="0"/>
+              <w:jc w:val="left"/>
+            </w:pPr>
+            <w:r>
+              <w:rPr>
+                <w:rFonts w:ascii="Arial" w:cs="Arial" w:eastAsia="Arial" w:hAnsi="Arial"/>
+                <w:b/>
+                <w:bCs/>
+                <w:color w:val="5A6472"/>
+                <w:sz w:val="18"/>
+                <w:szCs w:val="18"/>
+              </w:rPr>
+              <w:t xml:space="preserve">Hình 7 — </w:t>
+            </w:r>
+            <w:r>
+              <w:rPr>
+                <w:rFonts w:ascii="Arial" w:cs="Arial" w:eastAsia="Arial" w:hAnsi="Arial"/>
+                <w:b w:val="false"/>
+                <w:bCs w:val="false"/>
+                <w:i/>
+                <w:iCs/>
+                <w:color w:val="5A6472"/>
+                <w:sz w:val="18"/>
+                <w:szCs w:val="18"/>
+              </w:rPr>
+              <w:t xml:space="preserve">Công tắc thiết bị bị khoá, kèm lý do.</w:t>
+            </w:r>
+          </w:p>
+        </w:tc>
+        <w:tc>
+          <w:tcPr>
+            <w:tcW w:type="dxa" w:w="4558"/>
+            <w:tcMar>
+              <w:top w:type="dxa" w:w="0"/>
+              <w:left w:type="dxa" w:w="0"/>
+              <w:bottom w:type="dxa" w:w="0"/>
+              <w:right w:type="dxa" w:w="0"/>
+            </w:tcMar>
+            <w:vAlign w:val="top"/>
+          </w:tcPr>
+          <w:p>
+            <w:pPr>
+              <w:spacing w:after="0" w:before="60"/>
+            </w:pPr>
+          </w:p>
+          <w:p>
+            <w:pPr>
+              <w:spacing w:after="100" w:line="264"/>
+            </w:pPr>
+            <w:r>
+              <w:rPr>
+                <w:rFonts w:ascii="Arial" w:cs="Arial" w:eastAsia="Arial" w:hAnsi="Arial"/>
+                <w:b w:val="false"/>
+                <w:bCs w:val="false"/>
+                <w:i w:val="false"/>
+                <w:iCs w:val="false"/>
+                <w:color w:val="1A1A1A"/>
+                <w:sz w:val="21"/>
+                <w:szCs w:val="21"/>
+              </w:rPr>
+              <w:t xml:space="preserve">Có ba trường hợp em </w:t>
+            </w:r>
+            <w:r>
+              <w:rPr>
+                <w:rFonts w:ascii="Arial" w:cs="Arial" w:eastAsia="Arial" w:hAnsi="Arial"/>
+                <w:b/>
+                <w:bCs/>
+                <w:i w:val="false"/>
+                <w:iCs w:val="false"/>
+                <w:color w:val="1A1A1A"/>
+                <w:sz w:val="21"/>
+                <w:szCs w:val="21"/>
+              </w:rPr>
+              <w:t xml:space="preserve">không bật được</w:t>
+            </w:r>
+            <w:r>
+              <w:rPr>
+                <w:rFonts w:ascii="Arial" w:cs="Arial" w:eastAsia="Arial" w:hAnsi="Arial"/>
+                <w:b w:val="false"/>
+                <w:bCs w:val="false"/>
+                <w:i w:val="false"/>
+                <w:iCs w:val="false"/>
+                <w:color w:val="1A1A1A"/>
+                <w:sz w:val="21"/>
+                <w:szCs w:val="21"/>
+              </w:rPr>
+              <w:t xml:space="preserve"> công tắc thiết bị, và hệ thống ghi rõ lý do ngay dưới công tắc ①:</w:t>
+            </w:r>
+          </w:p>
+          <w:p>
+            <w:pPr>
+              <w:pStyle w:val="ListParagraph"/>
+              <w:numPr>
+                <w:ilvl w:val="0"/>
+                <w:numId w:val="1"/>
+              </w:numPr>
+              <w:spacing w:after="60" w:line="264"/>
+            </w:pPr>
+            <w:r>
+              <w:rPr>
+                <w:rFonts w:ascii="Arial" w:cs="Arial" w:eastAsia="Arial" w:hAnsi="Arial"/>
+                <w:b w:val="false"/>
+                <w:bCs w:val="false"/>
+                <w:i w:val="false"/>
+                <w:iCs w:val="false"/>
+                <w:color w:val="1A1A1A"/>
+                <w:sz w:val="21"/>
+                <w:szCs w:val="21"/>
+              </w:rPr>
+              <w:t xml:space="preserve">Em đang bị </w:t>
+            </w:r>
+            <w:r>
+              <w:rPr>
+                <w:rFonts w:ascii="Arial" w:cs="Arial" w:eastAsia="Arial" w:hAnsi="Arial"/>
+                <w:b/>
+                <w:bCs/>
+                <w:i w:val="false"/>
+                <w:iCs w:val="false"/>
+                <w:color w:val="1A1A1A"/>
+                <w:sz w:val="21"/>
+                <w:szCs w:val="21"/>
+              </w:rPr>
+              <w:t xml:space="preserve">tạm dừng dùng thiết bị</w:t>
+            </w:r>
+            <w:r>
+              <w:rPr>
+                <w:rFonts w:ascii="Arial" w:cs="Arial" w:eastAsia="Arial" w:hAnsi="Arial"/>
+                <w:b w:val="false"/>
+                <w:bCs w:val="false"/>
+                <w:i w:val="false"/>
+                <w:iCs w:val="false"/>
+                <w:color w:val="1A1A1A"/>
+                <w:sz w:val="21"/>
+                <w:szCs w:val="21"/>
+              </w:rPr>
+              <w:t xml:space="preserve"> vì vi phạm.</w:t>
+            </w:r>
+          </w:p>
+          <w:p>
+            <w:pPr>
+              <w:pStyle w:val="ListParagraph"/>
+              <w:numPr>
+                <w:ilvl w:val="0"/>
+                <w:numId w:val="1"/>
+              </w:numPr>
+              <w:spacing w:after="60" w:line="264"/>
+            </w:pPr>
+            <w:r>
+              <w:rPr>
+                <w:rFonts w:ascii="Arial" w:cs="Arial" w:eastAsia="Arial" w:hAnsi="Arial"/>
+                <w:b w:val="false"/>
+                <w:bCs w:val="false"/>
+                <w:i w:val="false"/>
+                <w:iCs w:val="false"/>
+                <w:color w:val="1A1A1A"/>
+                <w:sz w:val="21"/>
+                <w:szCs w:val="21"/>
+              </w:rPr>
+              <w:t xml:space="preserve">Lớp chỉ cho dùng thiết bị vào </w:t>
+            </w:r>
+            <w:r>
+              <w:rPr>
+                <w:rFonts w:ascii="Arial" w:cs="Arial" w:eastAsia="Arial" w:hAnsi="Arial"/>
+                <w:b/>
+                <w:bCs/>
+                <w:i w:val="false"/>
+                <w:iCs w:val="false"/>
+                <w:color w:val="1A1A1A"/>
+                <w:sz w:val="21"/>
+                <w:szCs w:val="21"/>
+              </w:rPr>
+              <w:t xml:space="preserve">một số thứ</w:t>
+            </w:r>
+            <w:r>
+              <w:rPr>
+                <w:rFonts w:ascii="Arial" w:cs="Arial" w:eastAsia="Arial" w:hAnsi="Arial"/>
+                <w:b w:val="false"/>
+                <w:bCs w:val="false"/>
+                <w:i w:val="false"/>
+                <w:iCs w:val="false"/>
+                <w:color w:val="1A1A1A"/>
+                <w:sz w:val="21"/>
+                <w:szCs w:val="21"/>
+              </w:rPr>
+              <w:t xml:space="preserve"> trong tuần, mà ngày em chọn không nằm trong đó.</w:t>
+            </w:r>
+          </w:p>
+          <w:p>
+            <w:pPr>
+              <w:pStyle w:val="ListParagraph"/>
+              <w:numPr>
+                <w:ilvl w:val="0"/>
+                <w:numId w:val="1"/>
+              </w:numPr>
+              <w:spacing w:after="60" w:line="264"/>
+            </w:pPr>
+            <w:r>
+              <w:rPr>
+                <w:rFonts w:ascii="Arial" w:cs="Arial" w:eastAsia="Arial" w:hAnsi="Arial"/>
+                <w:b w:val="false"/>
+                <w:bCs w:val="false"/>
+                <w:i w:val="false"/>
+                <w:iCs w:val="false"/>
+                <w:color w:val="1A1A1A"/>
+                <w:sz w:val="21"/>
+                <w:szCs w:val="21"/>
+              </w:rPr>
+              <w:t xml:space="preserve">Tuần đó em đã dùng </w:t>
+            </w:r>
+            <w:r>
+              <w:rPr>
+                <w:rFonts w:ascii="Arial" w:cs="Arial" w:eastAsia="Arial" w:hAnsi="Arial"/>
+                <w:b/>
+                <w:bCs/>
+                <w:i w:val="false"/>
+                <w:iCs w:val="false"/>
+                <w:color w:val="1A1A1A"/>
+                <w:sz w:val="21"/>
+                <w:szCs w:val="21"/>
+              </w:rPr>
+              <w:t xml:space="preserve">đủ số ngày</w:t>
+            </w:r>
+            <w:r>
+              <w:rPr>
+                <w:rFonts w:ascii="Arial" w:cs="Arial" w:eastAsia="Arial" w:hAnsi="Arial"/>
+                <w:b w:val="false"/>
+                <w:bCs w:val="false"/>
+                <w:i w:val="false"/>
+                <w:iCs w:val="false"/>
+                <w:color w:val="1A1A1A"/>
+                <w:sz w:val="21"/>
+                <w:szCs w:val="21"/>
+              </w:rPr>
+              <w:t xml:space="preserve"> lớp cho phép. Nhiều nhiệm vụ dùng thiết bị trong cùng một ngày chỉ tính là một ngày.</w:t>
+            </w:r>
+          </w:p>
+          <w:p>
+            <w:pPr>
+              <w:spacing w:after="100" w:line="264"/>
+            </w:pPr>
+            <w:r>
+              <w:rPr>
+                <w:rFonts w:ascii="Arial" w:cs="Arial" w:eastAsia="Arial" w:hAnsi="Arial"/>
+                <w:b w:val="false"/>
+                <w:bCs w:val="false"/>
+                <w:i w:val="false"/>
+                <w:iCs w:val="false"/>
+                <w:color w:val="1A1A1A"/>
+                <w:sz w:val="21"/>
+                <w:szCs w:val="21"/>
+              </w:rPr>
+              <w:t xml:space="preserve">Em vẫn đăng ký nhiệm vụ </w:t>
+            </w:r>
+            <w:r>
+              <w:rPr>
+                <w:rFonts w:ascii="Arial" w:cs="Arial" w:eastAsia="Arial" w:hAnsi="Arial"/>
+                <w:b/>
+                <w:bCs/>
+                <w:i w:val="false"/>
+                <w:iCs w:val="false"/>
+                <w:color w:val="1A1A1A"/>
+                <w:sz w:val="21"/>
+                <w:szCs w:val="21"/>
+              </w:rPr>
+              <w:t xml:space="preserve">không dùng thiết bị</w:t>
+            </w:r>
+            <w:r>
+              <w:rPr>
+                <w:rFonts w:ascii="Arial" w:cs="Arial" w:eastAsia="Arial" w:hAnsi="Arial"/>
+                <w:b w:val="false"/>
+                <w:bCs w:val="false"/>
+                <w:i w:val="false"/>
+                <w:iCs w:val="false"/>
+                <w:color w:val="1A1A1A"/>
+                <w:sz w:val="21"/>
+                <w:szCs w:val="21"/>
+              </w:rPr>
+              <w:t xml:space="preserve"> bình thường.</w:t>
+            </w:r>
+          </w:p>
+        </w:tc>
+      </w:tr>
+    </w:tbl>
+    <w:p>
+      <w:pPr>
+        <w:spacing w:after="150"/>
+      </w:pPr>
+    </w:p>
+    <w:p>
+      <w:pPr>
         <w:pStyle w:val="Heading1"/>
         <w:keepNext/>
         <w:pBdr>
@@ -3340,7 +3875,7 @@
                     </pic:cNvPicPr>
                   </pic:nvPicPr>
                   <pic:blipFill>
-                    <a:blip r:embed="rId14" cstate="none"/>
+                    <a:blip r:embed="rId15" cstate="none"/>
                     <a:srcRect/>
                     <a:stretch>
                       <a:fillRect/>
@@ -3376,7 +3911,7 @@
           <w:sz w:val="18"/>
           <w:szCs w:val="18"/>
         </w:rPr>
-        <w:t xml:space="preserve">Hình 7 — </w:t>
+        <w:t xml:space="preserve">Hình 8 — </w:t>
       </w:r>
       <w:r>
         <w:rPr>
@@ -3957,13 +4492,13 @@
         <w:tblLayout w:type="fixed"/>
       </w:tblPr>
       <w:tblGrid>
-        <w:gridCol w:w="4230"/>
-        <w:gridCol w:w="4840"/>
+        <w:gridCol w:w="3454"/>
+        <w:gridCol w:w="5616"/>
       </w:tblGrid>
       <w:tr>
         <w:tc>
           <w:tcPr>
-            <w:tcW w:type="dxa" w:w="4230"/>
+            <w:tcW w:type="dxa" w:w="3454"/>
             <w:tcMar>
               <w:top w:type="dxa" w:w="0"/>
               <w:left w:type="dxa" w:w="0"/>
@@ -3979,7 +4514,7 @@
             <w:r>
               <w:drawing>
                 <wp:inline distT="0" distB="0" distL="0" distR="0">
-                  <wp:extent cx="2667000" cy="3733800"/>
+                  <wp:extent cx="2143125" cy="4095750"/>
                   <wp:effectExtent t="0" r="0" b="0" l="0"/>
                   <wp:docPr id="1" name="" descr="" title=""/>
                   <wp:cNvGraphicFramePr>
@@ -3995,7 +4530,7 @@
                           </pic:cNvPicPr>
                         </pic:nvPicPr>
                         <pic:blipFill>
-                          <a:blip r:embed="rId15" cstate="none"/>
+                          <a:blip r:embed="rId16" cstate="none"/>
                           <a:srcRect/>
                           <a:stretch>
                             <a:fillRect/>
@@ -4004,7 +4539,7 @@
                         <pic:spPr bwMode="auto">
                           <a:xfrm>
                             <a:off x="0" y="0"/>
-                            <a:ext cx="2667000" cy="3733800"/>
+                            <a:ext cx="2143125" cy="4095750"/>
                           </a:xfrm>
                           <a:prstGeom prst="rect">
                             <a:avLst/>
@@ -4031,7 +4566,7 @@
                 <w:sz w:val="18"/>
                 <w:szCs w:val="18"/>
               </w:rPr>
-              <w:t xml:space="preserve">Hình 8 — </w:t>
+              <w:t xml:space="preserve">Hình 9 — </w:t>
             </w:r>
             <w:r>
               <w:rPr>
@@ -4050,7 +4585,7 @@
         </w:tc>
         <w:tc>
           <w:tcPr>
-            <w:tcW w:type="dxa" w:w="4840"/>
+            <w:tcW w:type="dxa" w:w="5616"/>
             <w:tcMar>
               <w:top w:type="dxa" w:w="0"/>
               <w:left w:type="dxa" w:w="0"/>
@@ -4599,7 +5134,7 @@
           <w:sz w:val="24"/>
           <w:szCs w:val="24"/>
         </w:rPr>
-        <w:t xml:space="preserve">Đính kèm sản phẩm (không bắt buộc)</w:t>
+        <w:t xml:space="preserve">Đính kèm minh chứng</w:t>
       </w:r>
     </w:p>
     <w:p>
@@ -4617,7 +5152,7 @@
           <w:sz w:val="21"/>
           <w:szCs w:val="21"/>
         </w:rPr>
-        <w:t xml:space="preserve">Nếu buổi đó có thứ chụp được — trang vở em đã làm, bài trình chiếu, đường dẫn tới bài của nhóm — em đính kèm ở phần dưới cùng. Tối đa 3 thứ.</w:t>
+        <w:t xml:space="preserve">Nếu buổi đó có thứ chụp được — trang vở em đã làm, bài trình chiếu, đường dẫn tới bài của nhóm — em đính kèm ở phần dưới cùng. Tối đa 3 thứ: ảnh, tệp PDF hoặc liên kết.</w:t>
       </w:r>
     </w:p>
     <w:p>
@@ -4630,7 +5165,7 @@
       <w:r>
         <w:drawing>
           <wp:inline distT="0" distB="0" distL="0" distR="0">
-            <wp:extent cx="5048250" cy="2219325"/>
+            <wp:extent cx="5048250" cy="2657475"/>
             <wp:effectExtent t="0" r="0" b="0" l="0"/>
             <wp:docPr id="1" name="" descr="" title=""/>
             <wp:cNvGraphicFramePr>
@@ -4646,7 +5181,7 @@
                     </pic:cNvPicPr>
                   </pic:nvPicPr>
                   <pic:blipFill>
-                    <a:blip r:embed="rId16" cstate="none"/>
+                    <a:blip r:embed="rId17" cstate="none"/>
                     <a:srcRect/>
                     <a:stretch>
                       <a:fillRect/>
@@ -4655,7 +5190,7 @@
                   <pic:spPr bwMode="auto">
                     <a:xfrm>
                       <a:off x="0" y="0"/>
-                      <a:ext cx="5048250" cy="2219325"/>
+                      <a:ext cx="5048250" cy="2657475"/>
                     </a:xfrm>
                     <a:prstGeom prst="rect">
                       <a:avLst/>
@@ -4682,7 +5217,7 @@
           <w:sz w:val="18"/>
           <w:szCs w:val="18"/>
         </w:rPr>
-        <w:t xml:space="preserve">Hình 9 — </w:t>
+        <w:t xml:space="preserve">Hình 10 — </w:t>
       </w:r>
       <w:r>
         <w:rPr>
@@ -4695,8 +5230,261 @@
           <w:sz w:val="18"/>
           <w:szCs w:val="18"/>
         </w:rPr>
-        <w:t xml:space="preserve">Phần đính kèm sản phẩm, nằm cuối cửa sổ cập nhật kết quả.</w:t>
-      </w:r>
+        <w:t xml:space="preserve">Phần đính kèm minh chứng của một nhiệm vụ có dùng thiết bị — ghi rõ </w:t>
+      </w:r>
+      <w:r>
+        <w:rPr>
+          <w:rFonts w:ascii="Arial" w:cs="Arial" w:eastAsia="Arial" w:hAnsi="Arial"/>
+          <w:b/>
+          <w:bCs/>
+          <w:i/>
+          <w:iCs/>
+          <w:color w:val="5A6472"/>
+          <w:sz w:val="18"/>
+          <w:szCs w:val="18"/>
+        </w:rPr>
+        <w:t xml:space="preserve">bắt buộc ít nhất 1</w:t>
+      </w:r>
+      <w:r>
+        <w:rPr>
+          <w:rFonts w:ascii="Arial" w:cs="Arial" w:eastAsia="Arial" w:hAnsi="Arial"/>
+          <w:b w:val="false"/>
+          <w:bCs w:val="false"/>
+          <w:i/>
+          <w:iCs/>
+          <w:color w:val="5A6472"/>
+          <w:sz w:val="18"/>
+          <w:szCs w:val="18"/>
+        </w:rPr>
+        <w:t xml:space="preserve">.</w:t>
+      </w:r>
+    </w:p>
+    <w:tbl>
+      <w:tblPr>
+        <w:tblW w:type="dxa" w:w="9070"/>
+        <w:tblBorders>
+          <w:top w:val="single" w:color="C9D2DA" w:sz="4"/>
+          <w:left w:val="single" w:color="C9D2DA" w:sz="4"/>
+          <w:bottom w:val="single" w:color="C9D2DA" w:sz="4"/>
+          <w:right w:val="single" w:color="C9D2DA" w:sz="4"/>
+          <w:insideH w:val="single" w:color="C9D2DA" w:sz="4"/>
+          <w:insideV w:val="single" w:color="C9D2DA" w:sz="4"/>
+        </w:tblBorders>
+        <w:tblLayout w:type="fixed"/>
+      </w:tblPr>
+      <w:tblGrid>
+        <w:gridCol w:w="2902"/>
+        <w:gridCol w:w="6168"/>
+      </w:tblGrid>
+      <w:tr>
+        <w:trPr>
+          <w:tblHeader/>
+        </w:trPr>
+        <w:tc>
+          <w:tcPr>
+            <w:tcW w:type="dxa" w:w="2902"/>
+            <w:shd w:fill="EDF2F7" w:val="clear"/>
+            <w:tcMar>
+              <w:top w:type="dxa" w:w="60"/>
+              <w:left w:type="dxa" w:w="120"/>
+              <w:bottom w:type="dxa" w:w="60"/>
+              <w:right w:type="dxa" w:w="120"/>
+            </w:tcMar>
+            <w:vAlign w:val="center"/>
+          </w:tcPr>
+          <w:p>
+            <w:pPr>
+              <w:spacing w:after="0" w:line="240"/>
+            </w:pPr>
+            <w:r>
+              <w:rPr>
+                <w:rFonts w:ascii="Arial" w:cs="Arial" w:eastAsia="Arial" w:hAnsi="Arial"/>
+                <w:b/>
+                <w:bCs/>
+                <w:i w:val="false"/>
+                <w:iCs w:val="false"/>
+                <w:color w:val="1A1A1A"/>
+                <w:sz w:val="19"/>
+                <w:szCs w:val="19"/>
+              </w:rPr>
+              <w:t xml:space="preserve">Nhiệm vụ</w:t>
+            </w:r>
+          </w:p>
+        </w:tc>
+        <w:tc>
+          <w:tcPr>
+            <w:tcW w:type="dxa" w:w="6168"/>
+            <w:shd w:fill="EDF2F7" w:val="clear"/>
+            <w:tcMar>
+              <w:top w:type="dxa" w:w="60"/>
+              <w:left w:type="dxa" w:w="120"/>
+              <w:bottom w:type="dxa" w:w="60"/>
+              <w:right w:type="dxa" w:w="120"/>
+            </w:tcMar>
+            <w:vAlign w:val="center"/>
+          </w:tcPr>
+          <w:p>
+            <w:pPr>
+              <w:spacing w:after="0" w:line="240"/>
+            </w:pPr>
+            <w:r>
+              <w:rPr>
+                <w:rFonts w:ascii="Arial" w:cs="Arial" w:eastAsia="Arial" w:hAnsi="Arial"/>
+                <w:b/>
+                <w:bCs/>
+                <w:i w:val="false"/>
+                <w:iCs w:val="false"/>
+                <w:color w:val="1A1A1A"/>
+                <w:sz w:val="19"/>
+                <w:szCs w:val="19"/>
+              </w:rPr>
+              <w:t xml:space="preserve">Minh chứng</w:t>
+            </w:r>
+          </w:p>
+        </w:tc>
+      </w:tr>
+      <w:tr>
+        <w:tc>
+          <w:tcPr>
+            <w:tcW w:type="dxa" w:w="2902"/>
+            <w:tcMar>
+              <w:top w:type="dxa" w:w="60"/>
+              <w:left w:type="dxa" w:w="120"/>
+              <w:bottom w:type="dxa" w:w="60"/>
+              <w:right w:type="dxa" w:w="120"/>
+            </w:tcMar>
+            <w:vAlign w:val="center"/>
+          </w:tcPr>
+          <w:p>
+            <w:pPr>
+              <w:spacing w:after="0" w:line="240"/>
+            </w:pPr>
+            <w:r>
+              <w:rPr>
+                <w:rFonts w:ascii="Arial" w:cs="Arial" w:eastAsia="Arial" w:hAnsi="Arial"/>
+                <w:b/>
+                <w:bCs/>
+                <w:i w:val="false"/>
+                <w:iCs w:val="false"/>
+                <w:color w:val="1A1A1A"/>
+                <w:sz w:val="19"/>
+                <w:szCs w:val="19"/>
+              </w:rPr>
+              <w:t xml:space="preserve">Có dùng thiết bị điện tử</w:t>
+            </w:r>
+          </w:p>
+        </w:tc>
+        <w:tc>
+          <w:tcPr>
+            <w:tcW w:type="dxa" w:w="6168"/>
+            <w:tcMar>
+              <w:top w:type="dxa" w:w="60"/>
+              <w:left w:type="dxa" w:w="120"/>
+              <w:bottom w:type="dxa" w:w="60"/>
+              <w:right w:type="dxa" w:w="120"/>
+            </w:tcMar>
+            <w:vAlign w:val="center"/>
+          </w:tcPr>
+          <w:p>
+            <w:pPr>
+              <w:spacing w:after="0" w:line="240"/>
+            </w:pPr>
+            <w:r>
+              <w:rPr>
+                <w:rFonts w:ascii="Arial" w:cs="Arial" w:eastAsia="Arial" w:hAnsi="Arial"/>
+                <w:b/>
+                <w:bCs/>
+                <w:i w:val="false"/>
+                <w:iCs w:val="false"/>
+                <w:color w:val="1A1A1A"/>
+                <w:sz w:val="19"/>
+                <w:szCs w:val="19"/>
+              </w:rPr>
+              <w:t xml:space="preserve">Bắt buộc ít nhất một</w:t>
+            </w:r>
+            <w:r>
+              <w:rPr>
+                <w:rFonts w:ascii="Arial" w:cs="Arial" w:eastAsia="Arial" w:hAnsi="Arial"/>
+                <w:b w:val="false"/>
+                <w:bCs w:val="false"/>
+                <w:i w:val="false"/>
+                <w:iCs w:val="false"/>
+                <w:color w:val="1A1A1A"/>
+                <w:sz w:val="19"/>
+                <w:szCs w:val="19"/>
+              </w:rPr>
+              <w:t xml:space="preserve"> ảnh, tệp hoặc liên kết. Chưa có thì hệ thống chưa cho lưu kết quả. Minh chứng cuối cùng không xoá được — muốn thay thì thêm cái mới trước rồi mới xoá cái cũ.</w:t>
+            </w:r>
+          </w:p>
+        </w:tc>
+      </w:tr>
+      <w:tr>
+        <w:tc>
+          <w:tcPr>
+            <w:tcW w:type="dxa" w:w="2902"/>
+            <w:tcMar>
+              <w:top w:type="dxa" w:w="60"/>
+              <w:left w:type="dxa" w:w="120"/>
+              <w:bottom w:type="dxa" w:w="60"/>
+              <w:right w:type="dxa" w:w="120"/>
+            </w:tcMar>
+            <w:vAlign w:val="center"/>
+          </w:tcPr>
+          <w:p>
+            <w:pPr>
+              <w:spacing w:after="0" w:line="240"/>
+            </w:pPr>
+            <w:r>
+              <w:rPr>
+                <w:rFonts w:ascii="Arial" w:cs="Arial" w:eastAsia="Arial" w:hAnsi="Arial"/>
+                <w:b w:val="false"/>
+                <w:bCs w:val="false"/>
+                <w:i w:val="false"/>
+                <w:iCs w:val="false"/>
+                <w:color w:val="1A1A1A"/>
+                <w:sz w:val="19"/>
+                <w:szCs w:val="19"/>
+              </w:rPr>
+              <w:t xml:space="preserve">Không dùng thiết bị</w:t>
+            </w:r>
+          </w:p>
+        </w:tc>
+        <w:tc>
+          <w:tcPr>
+            <w:tcW w:type="dxa" w:w="6168"/>
+            <w:tcMar>
+              <w:top w:type="dxa" w:w="60"/>
+              <w:left w:type="dxa" w:w="120"/>
+              <w:bottom w:type="dxa" w:w="60"/>
+              <w:right w:type="dxa" w:w="120"/>
+            </w:tcMar>
+            <w:vAlign w:val="center"/>
+          </w:tcPr>
+          <w:p>
+            <w:pPr>
+              <w:spacing w:after="0" w:line="240"/>
+            </w:pPr>
+            <w:r>
+              <w:rPr>
+                <w:rFonts w:ascii="Arial" w:cs="Arial" w:eastAsia="Arial" w:hAnsi="Arial"/>
+                <w:b w:val="false"/>
+                <w:bCs w:val="false"/>
+                <w:i w:val="false"/>
+                <w:iCs w:val="false"/>
+                <w:color w:val="1A1A1A"/>
+                <w:sz w:val="19"/>
+                <w:szCs w:val="19"/>
+              </w:rPr>
+              <w:t xml:space="preserve">Không bắt buộc. Có những việc không sinh ra sản phẩm nào — ôn bài, đọc sách. Phần chữ em viết mới là chính.</w:t>
+            </w:r>
+          </w:p>
+        </w:tc>
+      </w:tr>
+    </w:tbl>
+    <w:p>
+      <w:pPr>
+        <w:spacing w:after="110"/>
+      </w:pPr>
     </w:p>
     <w:tbl>
       <w:tblPr>
@@ -4744,28 +5532,41 @@
             <w:r>
               <w:rPr>
                 <w:rFonts w:ascii="Arial" w:cs="Arial" w:eastAsia="Arial" w:hAnsi="Arial"/>
-                <w:b/>
-                <w:bCs/>
+                <w:b w:val="false"/>
+                <w:bCs w:val="false"/>
                 <w:i w:val="false"/>
                 <w:iCs w:val="false"/>
                 <w:color w:val="1A1A1A"/>
                 <w:sz w:val="20"/>
                 <w:szCs w:val="20"/>
               </w:rPr>
-              <w:t xml:space="preserve">Không bắt buộc phải có ảnh.</w:t>
-            </w:r>
-            <w:r>
-              <w:rPr>
-                <w:rFonts w:ascii="Arial" w:cs="Arial" w:eastAsia="Arial" w:hAnsi="Arial"/>
-                <w:b w:val="false"/>
-                <w:bCs w:val="false"/>
+              <w:t xml:space="preserve">Minh chứng phải là </w:t>
+            </w:r>
+            <w:r>
+              <w:rPr>
+                <w:rFonts w:ascii="Arial" w:cs="Arial" w:eastAsia="Arial" w:hAnsi="Arial"/>
+                <w:b/>
+                <w:bCs/>
                 <w:i w:val="false"/>
                 <w:iCs w:val="false"/>
                 <w:color w:val="1A1A1A"/>
                 <w:sz w:val="20"/>
                 <w:szCs w:val="20"/>
               </w:rPr>
-              <w:t xml:space="preserve"> Có những việc không sinh ra sản phẩm nào — ôn bài, đọc sách. Phần chữ em viết mới là chính. Đừng chụp đại một trang giấy cho đủ thủ tục.</w:t>
+              <w:t xml:space="preserve">kết quả thật</w:t>
+            </w:r>
+            <w:r>
+              <w:rPr>
+                <w:rFonts w:ascii="Arial" w:cs="Arial" w:eastAsia="Arial" w:hAnsi="Arial"/>
+                <w:b w:val="false"/>
+                <w:bCs w:val="false"/>
+                <w:i w:val="false"/>
+                <w:iCs w:val="false"/>
+                <w:color w:val="1A1A1A"/>
+                <w:sz w:val="20"/>
+                <w:szCs w:val="20"/>
+              </w:rPr>
+              <w:t xml:space="preserve"> của buổi đó: ảnh chụp màn hình bài làm, tệp em đã làm ra, đường dẫn tới sản phẩm. Đừng chụp đại một trang giấy cho đủ thủ tục.</w:t>
             </w:r>
           </w:p>
         </w:tc>
@@ -4849,7 +5650,7 @@
                           </pic:cNvPicPr>
                         </pic:nvPicPr>
                         <pic:blipFill>
-                          <a:blip r:embed="rId17" cstate="none"/>
+                          <a:blip r:embed="rId18" cstate="none"/>
                           <a:srcRect/>
                           <a:stretch>
                             <a:fillRect/>
@@ -4885,7 +5686,7 @@
                 <w:sz w:val="18"/>
                 <w:szCs w:val="18"/>
               </w:rPr>
-              <w:t xml:space="preserve">Hình 10 — </w:t>
+              <w:t xml:space="preserve">Hình 11 — </w:t>
             </w:r>
             <w:r>
               <w:rPr>
@@ -5024,7 +5825,7 @@
           <w:sz w:val="28"/>
           <w:szCs w:val="28"/>
         </w:rPr>
-        <w:t xml:space="preserve">9. Quên đăng ký và lao động công ích</w:t>
+        <w:t xml:space="preserve">9. Thiết bị điện tử và xử lý vi phạm</w:t>
       </w:r>
     </w:p>
     <w:p>
@@ -5042,7 +5843,7 @@
           <w:sz w:val="21"/>
           <w:szCs w:val="21"/>
         </w:rPr>
-        <w:t xml:space="preserve">Ngày lớp có tiết tự học mà em </w:t>
+        <w:t xml:space="preserve">Giờ tự học có thể dùng thiết bị điện tử, nhưng phải </w:t>
       </w:r>
       <w:r>
         <w:rPr>
@@ -5055,7 +5856,7 @@
           <w:sz w:val="21"/>
           <w:szCs w:val="21"/>
         </w:rPr>
-        <w:t xml:space="preserve">không đăng ký kế hoạch nào</w:t>
+        <w:t xml:space="preserve">đăng ký trước</w:t>
       </w:r>
       <w:r>
         <w:rPr>
@@ -5068,7 +5869,7 @@
           <w:sz w:val="21"/>
           <w:szCs w:val="21"/>
         </w:rPr>
-        <w:t xml:space="preserve">, hệ thống ghi lại là một lần quên. Việc ghi nhận diễn ra lúc </w:t>
+        <w:t xml:space="preserve"> và được thầy cô </w:t>
       </w:r>
       <w:r>
         <w:rPr>
@@ -5081,7 +5882,7 @@
           <w:sz w:val="21"/>
           <w:szCs w:val="21"/>
         </w:rPr>
-        <w:t xml:space="preserve">0 giờ 5 phút sáng hôm sau</w:t>
+        <w:t xml:space="preserve">duyệt</w:t>
       </w:r>
       <w:r>
         <w:rPr>
@@ -5094,125 +5895,34 @@
           <w:sz w:val="21"/>
           <w:szCs w:val="21"/>
         </w:rPr>
-        <w:t xml:space="preserve">, nên em đăng ký muộn trong ngày vẫn kịp.</w:t>
-      </w:r>
-    </w:p>
-    <w:tbl>
-      <w:tblPr>
-        <w:tblW w:type="dxa" w:w="9070"/>
-        <w:tblBorders>
-          <w:top w:val="single" w:color="2F6FAF" w:sz="8"/>
-          <w:left w:val="single" w:color="2F6FAF" w:sz="24"/>
-          <w:bottom w:val="single" w:color="2F6FAF" w:sz="8"/>
-          <w:right w:val="single" w:color="2F6FAF" w:sz="8"/>
-          <w:insideH w:val="none"/>
-          <w:insideV w:val="none"/>
-        </w:tblBorders>
-        <w:tblLayout w:type="fixed"/>
-      </w:tblPr>
-      <w:tblGrid>
-        <w:gridCol w:w="9070"/>
-      </w:tblGrid>
-      <w:tr>
-        <w:tc>
-          <w:tcPr>
-            <w:tcW w:type="dxa" w:w="9070"/>
-            <w:shd w:fill="EAF2FB" w:val="clear"/>
-            <w:tcMar>
-              <w:top w:type="dxa" w:w="90"/>
-              <w:left w:type="dxa" w:w="150"/>
-              <w:bottom w:type="dxa" w:w="90"/>
-              <w:right w:type="dxa" w:w="150"/>
-            </w:tcMar>
-          </w:tcPr>
-          <w:p>
-            <w:pPr>
-              <w:spacing w:after="0" w:line="252"/>
-            </w:pPr>
-            <w:r>
-              <w:rPr>
-                <w:rFonts w:ascii="Arial" w:cs="Arial" w:eastAsia="Arial" w:hAnsi="Arial"/>
-                <w:b/>
-                <w:bCs/>
-                <w:color w:val="2F6FAF"/>
-                <w:sz w:val="18"/>
-                <w:szCs w:val="18"/>
-              </w:rPr>
-              <w:t xml:space="preserve">LƯU Ý  </w:t>
-            </w:r>
-            <w:r>
-              <w:rPr>
-                <w:rFonts w:ascii="Arial" w:cs="Arial" w:eastAsia="Arial" w:hAnsi="Arial"/>
-                <w:b w:val="false"/>
-                <w:bCs w:val="false"/>
-                <w:i w:val="false"/>
-                <w:iCs w:val="false"/>
-                <w:color w:val="1A1A1A"/>
-                <w:sz w:val="20"/>
-                <w:szCs w:val="20"/>
-              </w:rPr>
-              <w:t xml:space="preserve">Hai tiết </w:t>
-            </w:r>
-            <w:r>
-              <w:rPr>
-                <w:rFonts w:ascii="Arial" w:cs="Arial" w:eastAsia="Arial" w:hAnsi="Arial"/>
-                <w:b/>
-                <w:bCs/>
-                <w:i w:val="false"/>
-                <w:iCs w:val="false"/>
-                <w:color w:val="1A1A1A"/>
-                <w:sz w:val="20"/>
-                <w:szCs w:val="20"/>
-              </w:rPr>
-              <w:t xml:space="preserve">liền nhau</w:t>
-            </w:r>
-            <w:r>
-              <w:rPr>
-                <w:rFonts w:ascii="Arial" w:cs="Arial" w:eastAsia="Arial" w:hAnsi="Arial"/>
-                <w:b w:val="false"/>
-                <w:bCs w:val="false"/>
-                <w:i w:val="false"/>
-                <w:iCs w:val="false"/>
-                <w:color w:val="1A1A1A"/>
-                <w:sz w:val="20"/>
-                <w:szCs w:val="20"/>
-              </w:rPr>
-              <w:t xml:space="preserve"> trong cùng một buổi chỉ tính là </w:t>
-            </w:r>
-            <w:r>
-              <w:rPr>
-                <w:rFonts w:ascii="Arial" w:cs="Arial" w:eastAsia="Arial" w:hAnsi="Arial"/>
-                <w:b/>
-                <w:bCs/>
-                <w:i w:val="false"/>
-                <w:iCs w:val="false"/>
-                <w:color w:val="1A1A1A"/>
-                <w:sz w:val="20"/>
-                <w:szCs w:val="20"/>
-              </w:rPr>
-              <w:t xml:space="preserve">một</w:t>
-            </w:r>
-            <w:r>
-              <w:rPr>
-                <w:rFonts w:ascii="Arial" w:cs="Arial" w:eastAsia="Arial" w:hAnsi="Arial"/>
-                <w:b w:val="false"/>
-                <w:bCs w:val="false"/>
-                <w:i w:val="false"/>
-                <w:iCs w:val="false"/>
-                <w:color w:val="1A1A1A"/>
-                <w:sz w:val="20"/>
-                <w:szCs w:val="20"/>
-              </w:rPr>
-              <w:t xml:space="preserve"> lần quên. Ví dụ thứ Sáu tiết 8 và 9 mà em không đăng ký gì, đó là một lần, không phải hai.</w:t>
-            </w:r>
-          </w:p>
-        </w:tc>
-      </w:tr>
-    </w:tbl>
-    <w:p>
-      <w:pPr>
-        <w:spacing w:after="110"/>
-      </w:pPr>
+        <w:t xml:space="preserve">, và chỉ dùng </w:t>
+      </w:r>
+      <w:r>
+        <w:rPr>
+          <w:rFonts w:ascii="Arial" w:cs="Arial" w:eastAsia="Arial" w:hAnsi="Arial"/>
+          <w:b/>
+          <w:bCs/>
+          <w:i w:val="false"/>
+          <w:iCs w:val="false"/>
+          <w:color w:val="1A1A1A"/>
+          <w:sz w:val="21"/>
+          <w:szCs w:val="21"/>
+        </w:rPr>
+        <w:t xml:space="preserve">đúng mục đích</w:t>
+      </w:r>
+      <w:r>
+        <w:rPr>
+          <w:rFonts w:ascii="Arial" w:cs="Arial" w:eastAsia="Arial" w:hAnsi="Arial"/>
+          <w:b w:val="false"/>
+          <w:bCs w:val="false"/>
+          <w:i w:val="false"/>
+          <w:iCs w:val="false"/>
+          <w:color w:val="1A1A1A"/>
+          <w:sz w:val="21"/>
+          <w:szCs w:val="21"/>
+        </w:rPr>
+        <w:t xml:space="preserve"> đã ghi. Thầy cô có thể giới hạn số ngày được dùng mỗi tuần, hoặc chỉ cho dùng vào một số thứ.</w:t>
+      </w:r>
     </w:p>
     <w:p>
       <w:pPr>
@@ -5240,7 +5950,7 @@
                     </pic:cNvPicPr>
                   </pic:nvPicPr>
                   <pic:blipFill>
-                    <a:blip r:embed="rId18" cstate="none"/>
+                    <a:blip r:embed="rId19" cstate="none"/>
                     <a:srcRect/>
                     <a:stretch>
                       <a:fillRect/>
@@ -5276,7 +5986,7 @@
           <w:sz w:val="18"/>
           <w:szCs w:val="18"/>
         </w:rPr>
-        <w:t xml:space="preserve">Hình 11 — </w:t>
+        <w:t xml:space="preserve">Hình 12 — </w:t>
       </w:r>
       <w:r>
         <w:rPr>
@@ -5289,7 +5999,7 @@
           <w:sz w:val="18"/>
           <w:szCs w:val="18"/>
         </w:rPr>
-        <w:t xml:space="preserve">Thẻ điểm danh của một bạn đang phải lao động công ích.</w:t>
+        <w:t xml:space="preserve">Thẻ thiết bị điện tử của một bạn đang bị tạm dừng.</w:t>
       </w:r>
     </w:p>
     <w:p>
@@ -5319,12 +6029,12 @@
           <w:sz w:val="20"/>
           <w:szCs w:val="20"/>
         </w:rPr>
-        <w:t xml:space="preserve">Số lần em đã quên đăng ký trong học kỳ này.</w:t>
-      </w:r>
-    </w:p>
-    <w:p>
-      <w:pPr>
-        <w:spacing w:after="130" w:line="252"/>
+        <w:t xml:space="preserve">Số lần em đã vi phạm quy định thiết bị trong năm học.</w:t>
+      </w:r>
+    </w:p>
+    <w:p>
+      <w:pPr>
+        <w:spacing w:after="40" w:line="252"/>
         <w:ind w:left="340" w:hanging="340"/>
       </w:pPr>
       <w:r>
@@ -5349,7 +6059,37 @@
           <w:sz w:val="20"/>
           <w:szCs w:val="20"/>
         </w:rPr>
-        <w:t xml:space="preserve">Số lượt lao động công ích: đã làm mấy lượt, còn nợ mấy lượt, hạn hoàn thành khi nào.</w:t>
+        <w:t xml:space="preserve">Tuần này em đã dùng thiết bị mấy ngày — hoặc, nếu đang bị tạm dừng, tạm dừng đến hết ngày nào và vì sao.</w:t>
+      </w:r>
+    </w:p>
+    <w:p>
+      <w:pPr>
+        <w:spacing w:after="130" w:line="252"/>
+        <w:ind w:left="340" w:hanging="340"/>
+      </w:pPr>
+      <w:r>
+        <w:rPr>
+          <w:rFonts w:ascii="Arial" w:cs="Arial" w:eastAsia="Arial" w:hAnsi="Arial"/>
+          <w:b/>
+          <w:bCs/>
+          <w:color w:val="C05621"/>
+          <w:sz w:val="20"/>
+          <w:szCs w:val="20"/>
+        </w:rPr>
+        <w:t xml:space="preserve">3  </w:t>
+      </w:r>
+      <w:r>
+        <w:rPr>
+          <w:rFonts w:ascii="Arial" w:cs="Arial" w:eastAsia="Arial" w:hAnsi="Arial"/>
+          <w:b w:val="false"/>
+          <w:bCs w:val="false"/>
+          <w:i w:val="false"/>
+          <w:iCs w:val="false"/>
+          <w:color w:val="1A1A1A"/>
+          <w:sz w:val="20"/>
+          <w:szCs w:val="20"/>
+        </w:rPr>
+        <w:t xml:space="preserve">Số lượt lao động công ích em còn nợ.</w:t>
       </w:r>
     </w:p>
     <w:p>
@@ -5367,7 +6107,139 @@
           <w:sz w:val="24"/>
           <w:szCs w:val="24"/>
         </w:rPr>
-        <w:t xml:space="preserve">Quy định của lớp</w:t>
+        <w:t xml:space="preserve">Thế nào là vi phạm</w:t>
+      </w:r>
+    </w:p>
+    <w:tbl>
+      <w:tblPr>
+        <w:tblW w:type="dxa" w:w="9070"/>
+        <w:tblBorders>
+          <w:top w:val="single" w:color="C05621" w:sz="8"/>
+          <w:left w:val="single" w:color="C05621" w:sz="24"/>
+          <w:bottom w:val="single" w:color="C05621" w:sz="8"/>
+          <w:right w:val="single" w:color="C05621" w:sz="8"/>
+          <w:insideH w:val="none"/>
+          <w:insideV w:val="none"/>
+        </w:tblBorders>
+        <w:tblLayout w:type="fixed"/>
+      </w:tblPr>
+      <w:tblGrid>
+        <w:gridCol w:w="9070"/>
+      </w:tblGrid>
+      <w:tr>
+        <w:tc>
+          <w:tcPr>
+            <w:tcW w:type="dxa" w:w="9070"/>
+            <w:shd w:fill="FDF1E7" w:val="clear"/>
+            <w:tcMar>
+              <w:top w:type="dxa" w:w="90"/>
+              <w:left w:type="dxa" w:w="150"/>
+              <w:bottom w:type="dxa" w:w="90"/>
+              <w:right w:type="dxa" w:w="150"/>
+            </w:tcMar>
+          </w:tcPr>
+          <w:p>
+            <w:pPr>
+              <w:spacing w:after="50"/>
+            </w:pPr>
+            <w:r>
+              <w:rPr>
+                <w:rFonts w:ascii="Arial" w:cs="Arial" w:eastAsia="Arial" w:hAnsi="Arial"/>
+                <w:b/>
+                <w:bCs/>
+                <w:color w:val="C05621"/>
+                <w:sz w:val="18"/>
+                <w:szCs w:val="18"/>
+              </w:rPr>
+              <w:t xml:space="preserve">CẨN THẬN</w:t>
+            </w:r>
+          </w:p>
+          <w:p>
+            <w:pPr>
+              <w:spacing w:after="0" w:line="252"/>
+            </w:pPr>
+            <w:r>
+              <w:rPr>
+                <w:rFonts w:ascii="Arial" w:cs="Arial" w:eastAsia="Arial" w:hAnsi="Arial"/>
+                <w:b/>
+                <w:bCs/>
+                <w:i w:val="false"/>
+                <w:iCs w:val="false"/>
+                <w:color w:val="1A1A1A"/>
+                <w:sz w:val="20"/>
+                <w:szCs w:val="20"/>
+              </w:rPr>
+              <w:t xml:space="preserve">Không đăng ký mà tự ý dùng</w:t>
+            </w:r>
+            <w:r>
+              <w:rPr>
+                <w:rFonts w:ascii="Arial" w:cs="Arial" w:eastAsia="Arial" w:hAnsi="Arial"/>
+                <w:b w:val="false"/>
+                <w:bCs w:val="false"/>
+                <w:i w:val="false"/>
+                <w:iCs w:val="false"/>
+                <w:color w:val="1A1A1A"/>
+                <w:sz w:val="20"/>
+                <w:szCs w:val="20"/>
+              </w:rPr>
+              <w:t xml:space="preserve"> thiết bị trong giờ tự học.</w:t>
+            </w:r>
+          </w:p>
+          <w:p>
+            <w:pPr>
+              <w:spacing w:after="0" w:line="252"/>
+            </w:pPr>
+            <w:r>
+              <w:rPr>
+                <w:rFonts w:ascii="Arial" w:cs="Arial" w:eastAsia="Arial" w:hAnsi="Arial"/>
+                <w:b/>
+                <w:bCs/>
+                <w:i w:val="false"/>
+                <w:iCs w:val="false"/>
+                <w:color w:val="1A1A1A"/>
+                <w:sz w:val="20"/>
+                <w:szCs w:val="20"/>
+              </w:rPr>
+              <w:t xml:space="preserve">Dùng sai mục đích</w:t>
+            </w:r>
+            <w:r>
+              <w:rPr>
+                <w:rFonts w:ascii="Arial" w:cs="Arial" w:eastAsia="Arial" w:hAnsi="Arial"/>
+                <w:b w:val="false"/>
+                <w:bCs w:val="false"/>
+                <w:i w:val="false"/>
+                <w:iCs w:val="false"/>
+                <w:color w:val="1A1A1A"/>
+                <w:sz w:val="20"/>
+                <w:szCs w:val="20"/>
+              </w:rPr>
+              <w:t xml:space="preserve"> — đăng ký để tra cứu tài liệu nhưng lại chơi trò chơi, xem video giải trí, nhắn tin…</w:t>
+            </w:r>
+          </w:p>
+        </w:tc>
+      </w:tr>
+    </w:tbl>
+    <w:p>
+      <w:pPr>
+        <w:spacing w:after="110"/>
+      </w:pPr>
+    </w:p>
+    <w:p>
+      <w:pPr>
+        <w:pStyle w:val="Heading2"/>
+        <w:keepNext/>
+        <w:spacing w:after="100" w:before="240"/>
+      </w:pPr>
+      <w:r>
+        <w:rPr>
+          <w:rFonts w:ascii="Arial" w:cs="Arial" w:eastAsia="Arial" w:hAnsi="Arial"/>
+          <w:b/>
+          <w:bCs/>
+          <w:color w:val="1C4E80"/>
+          <w:sz w:val="24"/>
+          <w:szCs w:val="24"/>
+        </w:rPr>
+        <w:t xml:space="preserve">Quy định xử lý</w:t>
       </w:r>
     </w:p>
     <w:tbl>
@@ -5418,7 +6290,7 @@
                 <w:sz w:val="19"/>
                 <w:szCs w:val="19"/>
               </w:rPr>
-              <w:t xml:space="preserve">Số lần quên</w:t>
+              <w:t xml:space="preserve">Lần vi phạm</w:t>
             </w:r>
           </w:p>
         </w:tc>
@@ -5449,7 +6321,7 @@
                 <w:sz w:val="19"/>
                 <w:szCs w:val="19"/>
               </w:rPr>
-              <w:t xml:space="preserve">Hậu quả</w:t>
+              <w:t xml:space="preserve">Hình thức xử lý</w:t>
             </w:r>
           </w:p>
         </w:tc>
@@ -5481,7 +6353,7 @@
                 <w:sz w:val="19"/>
                 <w:szCs w:val="19"/>
               </w:rPr>
-              <w:t xml:space="preserve">1 – 3 lần</w:t>
+              <w:t xml:space="preserve">Lần 1</w:t>
             </w:r>
           </w:p>
         </w:tc>
@@ -5511,7 +6383,59 @@
                 <w:sz w:val="19"/>
                 <w:szCs w:val="19"/>
               </w:rPr>
-              <w:t xml:space="preserve">Được miễn trừ, không có kỷ luật.</w:t>
+              <w:t xml:space="preserve">Cấm dùng thiết bị </w:t>
+            </w:r>
+            <w:r>
+              <w:rPr>
+                <w:rFonts w:ascii="Arial" w:cs="Arial" w:eastAsia="Arial" w:hAnsi="Arial"/>
+                <w:b/>
+                <w:bCs/>
+                <w:i w:val="false"/>
+                <w:iCs w:val="false"/>
+                <w:color w:val="1A1A1A"/>
+                <w:sz w:val="19"/>
+                <w:szCs w:val="19"/>
+              </w:rPr>
+              <w:t xml:space="preserve">1 tuần</w:t>
+            </w:r>
+            <w:r>
+              <w:rPr>
+                <w:rFonts w:ascii="Arial" w:cs="Arial" w:eastAsia="Arial" w:hAnsi="Arial"/>
+                <w:b w:val="false"/>
+                <w:bCs w:val="false"/>
+                <w:i w:val="false"/>
+                <w:iCs w:val="false"/>
+                <w:color w:val="1A1A1A"/>
+                <w:sz w:val="19"/>
+                <w:szCs w:val="19"/>
+              </w:rPr>
+              <w:t xml:space="preserve"> + </w:t>
+            </w:r>
+            <w:r>
+              <w:rPr>
+                <w:rFonts w:ascii="Arial" w:cs="Arial" w:eastAsia="Arial" w:hAnsi="Arial"/>
+                <w:b/>
+                <w:bCs/>
+                <w:i w:val="false"/>
+                <w:iCs w:val="false"/>
+                <w:color w:val="1A1A1A"/>
+                <w:sz w:val="19"/>
+                <w:szCs w:val="19"/>
+              </w:rPr>
+              <w:t xml:space="preserve">5 lượt</w:t>
+            </w:r>
+            <w:r>
+              <w:rPr>
+                <w:rFonts w:ascii="Arial" w:cs="Arial" w:eastAsia="Arial" w:hAnsi="Arial"/>
+                <w:b w:val="false"/>
+                <w:bCs w:val="false"/>
+                <w:i w:val="false"/>
+                <w:iCs w:val="false"/>
+                <w:color w:val="1A1A1A"/>
+                <w:sz w:val="19"/>
+                <w:szCs w:val="19"/>
+              </w:rPr>
+              <w:t xml:space="preserve"> lao động công ích.</w:t>
             </w:r>
           </w:p>
         </w:tc>
@@ -5543,7 +6467,7 @@
                 <w:sz w:val="19"/>
                 <w:szCs w:val="19"/>
               </w:rPr>
-              <w:t xml:space="preserve">Lần thứ 4</w:t>
+              <w:t xml:space="preserve">Lần 2</w:t>
             </w:r>
           </w:p>
         </w:tc>
@@ -5573,7 +6497,59 @@
                 <w:sz w:val="19"/>
                 <w:szCs w:val="19"/>
               </w:rPr>
-              <w:t xml:space="preserve">Lao động công ích 5 lượt.</w:t>
+              <w:t xml:space="preserve">Cấm dùng thiết bị </w:t>
+            </w:r>
+            <w:r>
+              <w:rPr>
+                <w:rFonts w:ascii="Arial" w:cs="Arial" w:eastAsia="Arial" w:hAnsi="Arial"/>
+                <w:b/>
+                <w:bCs/>
+                <w:i w:val="false"/>
+                <w:iCs w:val="false"/>
+                <w:color w:val="1A1A1A"/>
+                <w:sz w:val="19"/>
+                <w:szCs w:val="19"/>
+              </w:rPr>
+              <w:t xml:space="preserve">2 tuần</w:t>
+            </w:r>
+            <w:r>
+              <w:rPr>
+                <w:rFonts w:ascii="Arial" w:cs="Arial" w:eastAsia="Arial" w:hAnsi="Arial"/>
+                <w:b w:val="false"/>
+                <w:bCs w:val="false"/>
+                <w:i w:val="false"/>
+                <w:iCs w:val="false"/>
+                <w:color w:val="1A1A1A"/>
+                <w:sz w:val="19"/>
+                <w:szCs w:val="19"/>
+              </w:rPr>
+              <w:t xml:space="preserve"> + </w:t>
+            </w:r>
+            <w:r>
+              <w:rPr>
+                <w:rFonts w:ascii="Arial" w:cs="Arial" w:eastAsia="Arial" w:hAnsi="Arial"/>
+                <w:b/>
+                <w:bCs/>
+                <w:i w:val="false"/>
+                <w:iCs w:val="false"/>
+                <w:color w:val="1A1A1A"/>
+                <w:sz w:val="19"/>
+                <w:szCs w:val="19"/>
+              </w:rPr>
+              <w:t xml:space="preserve">10 lượt</w:t>
+            </w:r>
+            <w:r>
+              <w:rPr>
+                <w:rFonts w:ascii="Arial" w:cs="Arial" w:eastAsia="Arial" w:hAnsi="Arial"/>
+                <w:b w:val="false"/>
+                <w:bCs w:val="false"/>
+                <w:i w:val="false"/>
+                <w:iCs w:val="false"/>
+                <w:color w:val="1A1A1A"/>
+                <w:sz w:val="19"/>
+                <w:szCs w:val="19"/>
+              </w:rPr>
+              <w:t xml:space="preserve"> lao động công ích.</w:t>
             </w:r>
           </w:p>
         </w:tc>
@@ -5605,7 +6581,7 @@
                 <w:sz w:val="19"/>
                 <w:szCs w:val="19"/>
               </w:rPr>
-              <w:t xml:space="preserve">Lần thứ 5</w:t>
+              <w:t xml:space="preserve">Lần 3</w:t>
             </w:r>
           </w:p>
         </w:tc>
@@ -5635,7 +6611,59 @@
                 <w:sz w:val="19"/>
                 <w:szCs w:val="19"/>
               </w:rPr>
-              <w:t xml:space="preserve">Lao động công ích 10 lượt.</w:t>
+              <w:t xml:space="preserve">Cấm dùng thiết bị </w:t>
+            </w:r>
+            <w:r>
+              <w:rPr>
+                <w:rFonts w:ascii="Arial" w:cs="Arial" w:eastAsia="Arial" w:hAnsi="Arial"/>
+                <w:b/>
+                <w:bCs/>
+                <w:i w:val="false"/>
+                <w:iCs w:val="false"/>
+                <w:color w:val="1A1A1A"/>
+                <w:sz w:val="19"/>
+                <w:szCs w:val="19"/>
+              </w:rPr>
+              <w:t xml:space="preserve">1 tháng</w:t>
+            </w:r>
+            <w:r>
+              <w:rPr>
+                <w:rFonts w:ascii="Arial" w:cs="Arial" w:eastAsia="Arial" w:hAnsi="Arial"/>
+                <w:b w:val="false"/>
+                <w:bCs w:val="false"/>
+                <w:i w:val="false"/>
+                <w:iCs w:val="false"/>
+                <w:color w:val="1A1A1A"/>
+                <w:sz w:val="19"/>
+                <w:szCs w:val="19"/>
+              </w:rPr>
+              <w:t xml:space="preserve"> + </w:t>
+            </w:r>
+            <w:r>
+              <w:rPr>
+                <w:rFonts w:ascii="Arial" w:cs="Arial" w:eastAsia="Arial" w:hAnsi="Arial"/>
+                <w:b/>
+                <w:bCs/>
+                <w:i w:val="false"/>
+                <w:iCs w:val="false"/>
+                <w:color w:val="1A1A1A"/>
+                <w:sz w:val="19"/>
+                <w:szCs w:val="19"/>
+              </w:rPr>
+              <w:t xml:space="preserve">20 lượt</w:t>
+            </w:r>
+            <w:r>
+              <w:rPr>
+                <w:rFonts w:ascii="Arial" w:cs="Arial" w:eastAsia="Arial" w:hAnsi="Arial"/>
+                <w:b w:val="false"/>
+                <w:bCs w:val="false"/>
+                <w:i w:val="false"/>
+                <w:iCs w:val="false"/>
+                <w:color w:val="1A1A1A"/>
+                <w:sz w:val="19"/>
+                <w:szCs w:val="19"/>
+              </w:rPr>
+              <w:t xml:space="preserve"> lao động công ích.</w:t>
             </w:r>
           </w:p>
         </w:tc>
@@ -5667,7 +6695,7 @@
                 <w:sz w:val="19"/>
                 <w:szCs w:val="19"/>
               </w:rPr>
-              <w:t xml:space="preserve">Từ lần thứ 6</w:t>
+              <w:t xml:space="preserve">Từ lần 4</w:t>
             </w:r>
           </w:p>
         </w:tc>
@@ -5689,15 +6717,28 @@
             <w:r>
               <w:rPr>
                 <w:rFonts w:ascii="Arial" w:cs="Arial" w:eastAsia="Arial" w:hAnsi="Arial"/>
-                <w:b w:val="false"/>
-                <w:bCs w:val="false"/>
+                <w:b/>
+                <w:bCs/>
                 <w:i w:val="false"/>
                 <w:iCs w:val="false"/>
                 <w:color w:val="1A1A1A"/>
                 <w:sz w:val="19"/>
                 <w:szCs w:val="19"/>
               </w:rPr>
-              <w:t xml:space="preserve">Thầy cô trao đổi trực tiếp với phụ huynh.</w:t>
+              <w:t xml:space="preserve">Mời phụ huynh</w:t>
+            </w:r>
+            <w:r>
+              <w:rPr>
+                <w:rFonts w:ascii="Arial" w:cs="Arial" w:eastAsia="Arial" w:hAnsi="Arial"/>
+                <w:b w:val="false"/>
+                <w:bCs w:val="false"/>
+                <w:i w:val="false"/>
+                <w:iCs w:val="false"/>
+                <w:color w:val="1A1A1A"/>
+                <w:sz w:val="19"/>
+                <w:szCs w:val="19"/>
+              </w:rPr>
+              <w:t xml:space="preserve"> lên trao đổi; vẫn cấm 1 tháng + 20 lượt.</w:t>
             </w:r>
           </w:p>
         </w:tc>
@@ -5723,7 +6764,59 @@
           <w:sz w:val="21"/>
           <w:szCs w:val="21"/>
         </w:rPr>
-        <w:t xml:space="preserve">Bảng quy định này cũng hiện ngay trong hệ thống, em bấm vào thẻ điểm danh là mở ra.</w:t>
+        <w:t xml:space="preserve">Mỗi lần xử lý </w:t>
+      </w:r>
+      <w:r>
+        <w:rPr>
+          <w:rFonts w:ascii="Arial" w:cs="Arial" w:eastAsia="Arial" w:hAnsi="Arial"/>
+          <w:b/>
+          <w:bCs/>
+          <w:i w:val="false"/>
+          <w:iCs w:val="false"/>
+          <w:color w:val="1A1A1A"/>
+          <w:sz w:val="21"/>
+          <w:szCs w:val="21"/>
+        </w:rPr>
+        <w:t xml:space="preserve">riêng</w:t>
+      </w:r>
+      <w:r>
+        <w:rPr>
+          <w:rFonts w:ascii="Arial" w:cs="Arial" w:eastAsia="Arial" w:hAnsi="Arial"/>
+          <w:b w:val="false"/>
+          <w:bCs w:val="false"/>
+          <w:i w:val="false"/>
+          <w:iCs w:val="false"/>
+          <w:color w:val="1A1A1A"/>
+          <w:sz w:val="21"/>
+          <w:szCs w:val="21"/>
+        </w:rPr>
+        <w:t xml:space="preserve">, không cộng dồn: lần 2 là 10 lượt của riêng lần 2, không phải 5 + 10. Đang bị cấm mà vi phạm tiếp thì lần cấm mới bắt đầu </w:t>
+      </w:r>
+      <w:r>
+        <w:rPr>
+          <w:rFonts w:ascii="Arial" w:cs="Arial" w:eastAsia="Arial" w:hAnsi="Arial"/>
+          <w:b/>
+          <w:bCs/>
+          <w:i w:val="false"/>
+          <w:iCs w:val="false"/>
+          <w:color w:val="1A1A1A"/>
+          <w:sz w:val="21"/>
+          <w:szCs w:val="21"/>
+        </w:rPr>
+        <w:t xml:space="preserve">sau khi</w:t>
+      </w:r>
+      <w:r>
+        <w:rPr>
+          <w:rFonts w:ascii="Arial" w:cs="Arial" w:eastAsia="Arial" w:hAnsi="Arial"/>
+          <w:b w:val="false"/>
+          <w:bCs w:val="false"/>
+          <w:i w:val="false"/>
+          <w:iCs w:val="false"/>
+          <w:color w:val="1A1A1A"/>
+          <w:sz w:val="21"/>
+          <w:szCs w:val="21"/>
+        </w:rPr>
+        <w:t xml:space="preserve"> lần cũ hết.</w:t>
       </w:r>
     </w:p>
     <w:p>
@@ -5736,7 +6829,7 @@
       <w:r>
         <w:drawing>
           <wp:inline distT="0" distB="0" distL="0" distR="0">
-            <wp:extent cx="5048250" cy="1800225"/>
+            <wp:extent cx="5048250" cy="2524125"/>
             <wp:effectExtent t="0" r="0" b="0" l="0"/>
             <wp:docPr id="1" name="" descr="" title=""/>
             <wp:cNvGraphicFramePr>
@@ -5752,7 +6845,7 @@
                     </pic:cNvPicPr>
                   </pic:nvPicPr>
                   <pic:blipFill>
-                    <a:blip r:embed="rId19" cstate="none"/>
+                    <a:blip r:embed="rId20" cstate="none"/>
                     <a:srcRect/>
                     <a:stretch>
                       <a:fillRect/>
@@ -5761,7 +6854,7 @@
                   <pic:spPr bwMode="auto">
                     <a:xfrm>
                       <a:off x="0" y="0"/>
-                      <a:ext cx="5048250" cy="1800225"/>
+                      <a:ext cx="5048250" cy="2524125"/>
                     </a:xfrm>
                     <a:prstGeom prst="rect">
                       <a:avLst/>
@@ -5788,7 +6881,7 @@
           <w:sz w:val="18"/>
           <w:szCs w:val="18"/>
         </w:rPr>
-        <w:t xml:space="preserve">Hình 12 — </w:t>
+        <w:t xml:space="preserve">Hình 13 — </w:t>
       </w:r>
       <w:r>
         <w:rPr>
@@ -5801,7 +6894,7 @@
           <w:sz w:val="18"/>
           <w:szCs w:val="18"/>
         </w:rPr>
-        <w:t xml:space="preserve">Bảng quy định mở ra từ thẻ điểm danh. Mức em đang ở được tô đậm.</w:t>
+        <w:t xml:space="preserve">Bấm vào thẻ thiết bị để mở bảng quy định và từng lần vi phạm của em. Mức em đang ở được tô đậm.</w:t>
       </w:r>
     </w:p>
     <w:tbl>
@@ -5834,7 +6927,7 @@
           </w:tcPr>
           <w:p>
             <w:pPr>
-              <w:spacing w:after="0" w:line="252"/>
+              <w:spacing w:after="50"/>
             </w:pPr>
             <w:r>
               <w:rPr>
@@ -5845,8 +6938,13 @@
                 <w:sz w:val="18"/>
                 <w:szCs w:val="18"/>
               </w:rPr>
-              <w:t xml:space="preserve">MẸO  </w:t>
-            </w:r>
+              <w:t xml:space="preserve">MẸO</w:t>
+            </w:r>
+          </w:p>
+          <w:p>
+            <w:pPr>
+              <w:spacing w:after="0" w:line="252"/>
+            </w:pPr>
             <w:r>
               <w:rPr>
                 <w:rFonts w:ascii="Arial" w:cs="Arial" w:eastAsia="Arial" w:hAnsi="Arial"/>
@@ -5858,7 +6956,7 @@
                 <w:sz w:val="20"/>
                 <w:szCs w:val="20"/>
               </w:rPr>
-              <w:t xml:space="preserve">Nếu em thấy có buổi bị ghi nhầm — hôm đó em nghỉ có phép, hoặc cả lớp đi sự kiện — hãy nhắn thầy cô. Thầy cô </w:t>
+              <w:t xml:space="preserve">Trong thời gian bị tạm dừng, em </w:t>
             </w:r>
             <w:r>
               <w:rPr>
@@ -5871,7 +6969,7 @@
                 <w:sz w:val="20"/>
                 <w:szCs w:val="20"/>
               </w:rPr>
-              <w:t xml:space="preserve">miễn buổi</w:t>
+              <w:t xml:space="preserve">vẫn tự học bình thường</w:t>
             </w:r>
             <w:r>
               <w:rPr>
@@ -5884,7 +6982,51 @@
                 <w:sz w:val="20"/>
                 <w:szCs w:val="20"/>
               </w:rPr>
-              <w:t xml:space="preserve"> đó được và lần quên sẽ bị xoá khỏi sổ.</w:t>
+              <w:t xml:space="preserve"> — chỉ không đăng ký dùng thiết bị được. Những buổi thiết bị đã được duyệt rơi vào thời gian đó sẽ tự bị huỷ duyệt và em nhận thông báo.</w:t>
+            </w:r>
+          </w:p>
+          <w:p>
+            <w:pPr>
+              <w:spacing w:after="0" w:line="252"/>
+            </w:pPr>
+            <w:r>
+              <w:rPr>
+                <w:rFonts w:ascii="Arial" w:cs="Arial" w:eastAsia="Arial" w:hAnsi="Arial"/>
+                <w:b w:val="false"/>
+                <w:bCs w:val="false"/>
+                <w:i w:val="false"/>
+                <w:iCs w:val="false"/>
+                <w:color w:val="1A1A1A"/>
+                <w:sz w:val="20"/>
+                <w:szCs w:val="20"/>
+              </w:rPr>
+              <w:t xml:space="preserve">Nếu em thấy mình bị ghi nhầm, hãy nhắn thầy cô. Thầy cô </w:t>
+            </w:r>
+            <w:r>
+              <w:rPr>
+                <w:rFonts w:ascii="Arial" w:cs="Arial" w:eastAsia="Arial" w:hAnsi="Arial"/>
+                <w:b/>
+                <w:bCs/>
+                <w:i w:val="false"/>
+                <w:iCs w:val="false"/>
+                <w:color w:val="1A1A1A"/>
+                <w:sz w:val="20"/>
+                <w:szCs w:val="20"/>
+              </w:rPr>
+              <w:t xml:space="preserve">huỷ</w:t>
+            </w:r>
+            <w:r>
+              <w:rPr>
+                <w:rFonts w:ascii="Arial" w:cs="Arial" w:eastAsia="Arial" w:hAnsi="Arial"/>
+                <w:b w:val="false"/>
+                <w:bCs w:val="false"/>
+                <w:i w:val="false"/>
+                <w:iCs w:val="false"/>
+                <w:color w:val="1A1A1A"/>
+                <w:sz w:val="20"/>
+                <w:szCs w:val="20"/>
+              </w:rPr>
+              <w:t xml:space="preserve"> lần ghi nhầm đó được — lần đó sẽ không tính nữa.</w:t>
             </w:r>
           </w:p>
         </w:tc>
@@ -5968,7 +7110,7 @@
                           </pic:cNvPicPr>
                         </pic:nvPicPr>
                         <pic:blipFill>
-                          <a:blip r:embed="rId20" cstate="none"/>
+                          <a:blip r:embed="rId21" cstate="none"/>
                           <a:srcRect/>
                           <a:stretch>
                             <a:fillRect/>
@@ -6004,7 +7146,7 @@
                 <w:sz w:val="18"/>
                 <w:szCs w:val="18"/>
               </w:rPr>
-              <w:t xml:space="preserve">Hình 13 — </w:t>
+              <w:t xml:space="preserve">Hình 14 — </w:t>
             </w:r>
             <w:r>
               <w:rPr>
@@ -6198,7 +7340,7 @@
                           </pic:cNvPicPr>
                         </pic:nvPicPr>
                         <pic:blipFill>
-                          <a:blip r:embed="rId21" cstate="none"/>
+                          <a:blip r:embed="rId22" cstate="none"/>
                           <a:srcRect/>
                           <a:stretch>
                             <a:fillRect/>
@@ -6234,7 +7376,7 @@
                 <w:sz w:val="18"/>
                 <w:szCs w:val="18"/>
               </w:rPr>
-              <w:t xml:space="preserve">Hình 14 — </w:t>
+              <w:t xml:space="preserve">Hình 15 — </w:t>
             </w:r>
             <w:r>
               <w:rPr>
@@ -6402,7 +7544,7 @@
                     </pic:cNvPicPr>
                   </pic:nvPicPr>
                   <pic:blipFill>
-                    <a:blip r:embed="rId22" cstate="none"/>
+                    <a:blip r:embed="rId23" cstate="none"/>
                     <a:srcRect/>
                     <a:stretch>
                       <a:fillRect/>
@@ -6438,7 +7580,7 @@
           <w:sz w:val="18"/>
           <w:szCs w:val="18"/>
         </w:rPr>
-        <w:t xml:space="preserve">Hình 15 — </w:t>
+        <w:t xml:space="preserve">Hình 16 — </w:t>
       </w:r>
       <w:r>
         <w:rPr>
@@ -6851,7 +7993,7 @@
                     </pic:cNvPicPr>
                   </pic:nvPicPr>
                   <pic:blipFill>
-                    <a:blip r:embed="rId23" cstate="none"/>
+                    <a:blip r:embed="rId24" cstate="none"/>
                     <a:srcRect/>
                     <a:stretch>
                       <a:fillRect/>
@@ -6887,7 +8029,7 @@
           <w:sz w:val="18"/>
           <w:szCs w:val="18"/>
         </w:rPr>
-        <w:t xml:space="preserve">Hình 16 — </w:t>
+        <w:t xml:space="preserve">Hình 17 — </w:t>
       </w:r>
       <w:r>
         <w:rPr>
@@ -6976,7 +8118,7 @@
                           </pic:cNvPicPr>
                         </pic:nvPicPr>
                         <pic:blipFill>
-                          <a:blip r:embed="rId24" cstate="none"/>
+                          <a:blip r:embed="rId25" cstate="none"/>
                           <a:srcRect/>
                           <a:stretch>
                             <a:fillRect/>
@@ -7012,7 +8154,7 @@
                 <w:sz w:val="18"/>
                 <w:szCs w:val="18"/>
               </w:rPr>
-              <w:t xml:space="preserve">Hình 17 — </w:t>
+              <w:t xml:space="preserve">Hình 18 — </w:t>
             </w:r>
             <w:r>
               <w:rPr>
@@ -7273,7 +8415,7 @@
                 <w:sz w:val="19"/>
                 <w:szCs w:val="19"/>
               </w:rPr>
-              <w:t xml:space="preserve">Em quên không đăng ký, giờ đăng ký bù được không?</w:t>
+              <w:t xml:space="preserve">Hôm nay em không dùng máy, có phải đăng ký không?</w:t>
             </w:r>
           </w:p>
         </w:tc>
@@ -7303,33 +8445,7 @@
                 <w:sz w:val="19"/>
                 <w:szCs w:val="19"/>
               </w:rPr>
-              <w:t xml:space="preserve">Được, và em nên làm ngay. Hệ thống chốt sổ lúc 0 giờ 5 sáng hôm sau, nên đăng ký trong ngày vẫn kịp — chỉ bị đánh dấu </w:t>
-            </w:r>
-            <w:r>
-              <w:rPr>
-                <w:rFonts w:ascii="Arial" w:cs="Arial" w:eastAsia="Arial" w:hAnsi="Arial"/>
-                <w:b/>
-                <w:bCs/>
-                <w:i w:val="false"/>
-                <w:iCs w:val="false"/>
-                <w:color w:val="1A1A1A"/>
-                <w:sz w:val="19"/>
-                <w:szCs w:val="19"/>
-              </w:rPr>
-              <w:t xml:space="preserve">Trễ</w:t>
-            </w:r>
-            <w:r>
-              <w:rPr>
-                <w:rFonts w:ascii="Arial" w:cs="Arial" w:eastAsia="Arial" w:hAnsi="Arial"/>
-                <w:b w:val="false"/>
-                <w:bCs w:val="false"/>
-                <w:i w:val="false"/>
-                <w:iCs w:val="false"/>
-                <w:color w:val="1A1A1A"/>
-                <w:sz w:val="19"/>
-                <w:szCs w:val="19"/>
-              </w:rPr>
-              <w:t xml:space="preserve"> thôi, không tính là quên.</w:t>
+              <w:t xml:space="preserve">Không bắt buộc. Em vẫn nên đăng ký để tự lên kế hoạch và ghi lại kết quả, nhưng không đăng ký thì cũng không bị xử lý gì.</w:t>
             </w:r>
           </w:p>
         </w:tc>
@@ -7361,7 +8477,7 @@
                 <w:sz w:val="19"/>
                 <w:szCs w:val="19"/>
               </w:rPr>
-              <w:t xml:space="preserve">Em đăng ký rồi nhưng hôm đó làm việc khác, ghi sao?</w:t>
+              <w:t xml:space="preserve">Em quên đăng ký mà buổi đó cần dùng máy thì sao?</w:t>
             </w:r>
           </w:p>
         </w:tc>
@@ -7391,7 +8507,59 @@
                 <w:sz w:val="19"/>
                 <w:szCs w:val="19"/>
               </w:rPr>
-              <w:t xml:space="preserve">Cứ ghi đúng sự thật vào ô kết quả. Thầy cô cần biết em thực sự làm gì, không phải một bản báo cáo đẹp.</w:t>
+              <w:t xml:space="preserve">Đăng ký ngay trước khi dùng — sau 24:00 hôm trước thì bị đánh dấu </w:t>
+            </w:r>
+            <w:r>
+              <w:rPr>
+                <w:rFonts w:ascii="Arial" w:cs="Arial" w:eastAsia="Arial" w:hAnsi="Arial"/>
+                <w:b/>
+                <w:bCs/>
+                <w:i w:val="false"/>
+                <w:iCs w:val="false"/>
+                <w:color w:val="1A1A1A"/>
+                <w:sz w:val="19"/>
+                <w:szCs w:val="19"/>
+              </w:rPr>
+              <w:t xml:space="preserve">Trễ</w:t>
+            </w:r>
+            <w:r>
+              <w:rPr>
+                <w:rFonts w:ascii="Arial" w:cs="Arial" w:eastAsia="Arial" w:hAnsi="Arial"/>
+                <w:b w:val="false"/>
+                <w:bCs w:val="false"/>
+                <w:i w:val="false"/>
+                <w:iCs w:val="false"/>
+                <w:color w:val="1A1A1A"/>
+                <w:sz w:val="19"/>
+                <w:szCs w:val="19"/>
+              </w:rPr>
+              <w:t xml:space="preserve">, và nếu lớp khoá đăng ký trễ thì không đăng ký được nữa. Khi đó em </w:t>
+            </w:r>
+            <w:r>
+              <w:rPr>
+                <w:rFonts w:ascii="Arial" w:cs="Arial" w:eastAsia="Arial" w:hAnsi="Arial"/>
+                <w:b/>
+                <w:bCs/>
+                <w:i w:val="false"/>
+                <w:iCs w:val="false"/>
+                <w:color w:val="1A1A1A"/>
+                <w:sz w:val="19"/>
+                <w:szCs w:val="19"/>
+              </w:rPr>
+              <w:t xml:space="preserve">không được dùng</w:t>
+            </w:r>
+            <w:r>
+              <w:rPr>
+                <w:rFonts w:ascii="Arial" w:cs="Arial" w:eastAsia="Arial" w:hAnsi="Arial"/>
+                <w:b w:val="false"/>
+                <w:bCs w:val="false"/>
+                <w:i w:val="false"/>
+                <w:iCs w:val="false"/>
+                <w:color w:val="1A1A1A"/>
+                <w:sz w:val="19"/>
+                <w:szCs w:val="19"/>
+              </w:rPr>
+              <w:t xml:space="preserve"> thiết bị; dùng là vi phạm.</w:t>
             </w:r>
           </w:p>
         </w:tc>
@@ -7423,7 +8591,7 @@
                 <w:sz w:val="19"/>
                 <w:szCs w:val="19"/>
               </w:rPr>
-              <w:t xml:space="preserve">Em nghỉ ốm đúng buổi tự học thì sao?</w:t>
+              <w:t xml:space="preserve">Em đăng ký rồi nhưng hôm đó làm việc khác, ghi sao?</w:t>
             </w:r>
           </w:p>
         </w:tc>
@@ -7453,21 +8621,57 @@
                 <w:sz w:val="19"/>
                 <w:szCs w:val="19"/>
               </w:rPr>
-              <w:t xml:space="preserve">Báo thầy cô. Thầy cô bấm </w:t>
-            </w:r>
-            <w:r>
-              <w:rPr>
-                <w:rFonts w:ascii="Arial" w:cs="Arial" w:eastAsia="Arial" w:hAnsi="Arial"/>
-                <w:b/>
-                <w:bCs/>
+              <w:t xml:space="preserve">Cứ ghi đúng sự thật vào ô kết quả. Thầy cô cần biết em thực sự làm gì, không phải một bản báo cáo đẹp.</w:t>
+            </w:r>
+          </w:p>
+        </w:tc>
+      </w:tr>
+      <w:tr>
+        <w:tc>
+          <w:tcPr>
+            <w:tcW w:type="dxa" w:w="3084"/>
+            <w:tcMar>
+              <w:top w:type="dxa" w:w="60"/>
+              <w:left w:type="dxa" w:w="120"/>
+              <w:bottom w:type="dxa" w:w="60"/>
+              <w:right w:type="dxa" w:w="120"/>
+            </w:tcMar>
+            <w:vAlign w:val="center"/>
+          </w:tcPr>
+          <w:p>
+            <w:pPr>
+              <w:spacing w:after="0" w:line="240"/>
+            </w:pPr>
+            <w:r>
+              <w:rPr>
+                <w:rFonts w:ascii="Arial" w:cs="Arial" w:eastAsia="Arial" w:hAnsi="Arial"/>
+                <w:b w:val="false"/>
+                <w:bCs w:val="false"/>
                 <w:i w:val="false"/>
                 <w:iCs w:val="false"/>
                 <w:color w:val="1A1A1A"/>
                 <w:sz w:val="19"/>
                 <w:szCs w:val="19"/>
               </w:rPr>
-              <w:t xml:space="preserve">miễn buổi</w:t>
-            </w:r>
+              <w:t xml:space="preserve">Sao công tắc thiết bị của em bị mờ, không bật được?</w:t>
+            </w:r>
+          </w:p>
+        </w:tc>
+        <w:tc>
+          <w:tcPr>
+            <w:tcW w:type="dxa" w:w="5986"/>
+            <w:tcMar>
+              <w:top w:type="dxa" w:w="60"/>
+              <w:left w:type="dxa" w:w="120"/>
+              <w:bottom w:type="dxa" w:w="60"/>
+              <w:right w:type="dxa" w:w="120"/>
+            </w:tcMar>
+            <w:vAlign w:val="center"/>
+          </w:tcPr>
+          <w:p>
+            <w:pPr>
+              <w:spacing w:after="0" w:line="240"/>
+            </w:pPr>
             <w:r>
               <w:rPr>
                 <w:rFonts w:ascii="Arial" w:cs="Arial" w:eastAsia="Arial" w:hAnsi="Arial"/>
@@ -7479,7 +8683,7 @@
                 <w:sz w:val="19"/>
                 <w:szCs w:val="19"/>
               </w:rPr>
-              <w:t xml:space="preserve"> cho em, buổi đó không tính là quên đăng ký.</w:t>
+              <w:t xml:space="preserve">Đọc dòng chữ đỏ ngay dưới công tắc: em đang bị tạm dừng, hoặc ngày đó lớp không cho dùng thiết bị, hoặc tuần đó em đã dùng đủ số ngày.</w:t>
             </w:r>
           </w:p>
         </w:tc>

</xml_diff>

<commit_message>
Sua 3 loi: tro giang tu xu ly ke hoach cua minh, ke hoach bi tu choi khong can ket qua, minh chung chi khi thiet bi da duyet
- schema-20 (da ap): plan_rejected(), plan_status 'Khong can ket qua', job khong nhac/tu cham
  ke hoach bi tu choi, go 3 lan tu cham oan (sao luu auto_eval_go_bo), minh chung chi khi
  thiet bi 'Da duyet', tro giang tu duyet/cham khi co quyen, chan sua noi dung ke hoach da qua
- Giao dien hoc sinh/GV/tro giang + Huong dan, Word/PDF
- Bo thu: thu-tbdt 55/55, thu-tro-giang 31/31

Co-Authored-By: Claude Opus 5.5 <noreply@anthropic.com>
</commit_message>
<xml_diff>
--- a/docs/huong-dan/Huong-dan-hoc-sinh.docx
+++ b/docs/huong-dan/Huong-dan-hoc-sinh.docx
@@ -96,7 +96,7 @@
           <w:sz w:val="18"/>
           <w:szCs w:val="18"/>
         </w:rPr>
-        <w:t xml:space="preserve">Cập nhật 4/10/2026</w:t>
+        <w:t xml:space="preserve">Cập nhật 8/10/2026</w:t>
       </w:r>
     </w:p>
     <w:p>
@@ -4402,7 +4402,7 @@
                 <w:sz w:val="19"/>
                 <w:szCs w:val="19"/>
               </w:rPr>
-              <w:t xml:space="preserve">Thầy cô trả về, kèm lý do. Em sửa rồi gửi lại.</w:t>
+              <w:t xml:space="preserve">Thầy cô trả về, kèm lý do. Em sửa rồi gửi lại. Tới giờ học mà chưa sửa thì coi như bị từ chối — không cần nộp kết quả.</w:t>
             </w:r>
           </w:p>
         </w:tc>
@@ -5370,7 +5370,7 @@
                 <w:sz w:val="19"/>
                 <w:szCs w:val="19"/>
               </w:rPr>
-              <w:t xml:space="preserve">Có dùng thiết bị điện tử</w:t>
+              <w:t xml:space="preserve">Được duyệt dùng thiết bị</w:t>
             </w:r>
           </w:p>
         </w:tc>
@@ -5475,7 +5475,95 @@
                 <w:sz w:val="19"/>
                 <w:szCs w:val="19"/>
               </w:rPr>
-              <w:t xml:space="preserve">Không bắt buộc. Có những việc không sinh ra sản phẩm nào — ôn bài, đọc sách. Phần chữ em viết mới là chính.</w:t>
+              <w:t xml:space="preserve">Không bắt buộc — chỉ cần ghi kết quả. Có những việc không sinh ra sản phẩm nào — ôn bài, đọc sách. Phần chữ em viết mới là chính.</w:t>
+            </w:r>
+          </w:p>
+        </w:tc>
+      </w:tr>
+      <w:tr>
+        <w:tc>
+          <w:tcPr>
+            <w:tcW w:type="dxa" w:w="2902"/>
+            <w:tcMar>
+              <w:top w:type="dxa" w:w="60"/>
+              <w:left w:type="dxa" w:w="120"/>
+              <w:bottom w:type="dxa" w:w="60"/>
+              <w:right w:type="dxa" w:w="120"/>
+            </w:tcMar>
+            <w:vAlign w:val="center"/>
+          </w:tcPr>
+          <w:p>
+            <w:pPr>
+              <w:spacing w:after="0" w:line="240"/>
+            </w:pPr>
+            <w:r>
+              <w:rPr>
+                <w:rFonts w:ascii="Arial" w:cs="Arial" w:eastAsia="Arial" w:hAnsi="Arial"/>
+                <w:b w:val="false"/>
+                <w:bCs w:val="false"/>
+                <w:i w:val="false"/>
+                <w:iCs w:val="false"/>
+                <w:color w:val="1A1A1A"/>
+                <w:sz w:val="19"/>
+                <w:szCs w:val="19"/>
+              </w:rPr>
+              <w:t xml:space="preserve">Bị từ chối</w:t>
+            </w:r>
+          </w:p>
+        </w:tc>
+        <w:tc>
+          <w:tcPr>
+            <w:tcW w:type="dxa" w:w="6168"/>
+            <w:tcMar>
+              <w:top w:type="dxa" w:w="60"/>
+              <w:left w:type="dxa" w:w="120"/>
+              <w:bottom w:type="dxa" w:w="60"/>
+              <w:right w:type="dxa" w:w="120"/>
+            </w:tcMar>
+            <w:vAlign w:val="center"/>
+          </w:tcPr>
+          <w:p>
+            <w:pPr>
+              <w:spacing w:after="0" w:line="240"/>
+            </w:pPr>
+            <w:r>
+              <w:rPr>
+                <w:rFonts w:ascii="Arial" w:cs="Arial" w:eastAsia="Arial" w:hAnsi="Arial"/>
+                <w:b w:val="false"/>
+                <w:bCs w:val="false"/>
+                <w:i w:val="false"/>
+                <w:iCs w:val="false"/>
+                <w:color w:val="1A1A1A"/>
+                <w:sz w:val="19"/>
+                <w:szCs w:val="19"/>
+              </w:rPr>
+              <w:t xml:space="preserve">Kế hoạch bị trả về hoặc thiết bị bị từ chối: </w:t>
+            </w:r>
+            <w:r>
+              <w:rPr>
+                <w:rFonts w:ascii="Arial" w:cs="Arial" w:eastAsia="Arial" w:hAnsi="Arial"/>
+                <w:b/>
+                <w:bCs/>
+                <w:i w:val="false"/>
+                <w:iCs w:val="false"/>
+                <w:color w:val="1A1A1A"/>
+                <w:sz w:val="19"/>
+                <w:szCs w:val="19"/>
+              </w:rPr>
+              <w:t xml:space="preserve">không cần nộp kết quả</w:t>
+            </w:r>
+            <w:r>
+              <w:rPr>
+                <w:rFonts w:ascii="Arial" w:cs="Arial" w:eastAsia="Arial" w:hAnsi="Arial"/>
+                <w:b w:val="false"/>
+                <w:bCs w:val="false"/>
+                <w:i w:val="false"/>
+                <w:iCs w:val="false"/>
+                <w:color w:val="1A1A1A"/>
+                <w:sz w:val="19"/>
+                <w:szCs w:val="19"/>
+              </w:rPr>
+              <w:t xml:space="preserve">, không bị nhắc trễ hạn, không bị tự chấm 1 sao.</w:t>
             </w:r>
           </w:p>
         </w:tc>

</xml_diff>